<commit_message>
Align the PhD proposal with the audited preliminary results
Narrow the thesis to conditional interval coverage and a later evidence-checked report. Record the VN30 and BID numbers, 19 references, and the data fields that must not be invented.

Co-authored-by: Copilot <223556219+Copilot@users.noreply.github.com>
</commit_message>
<xml_diff>
--- a/docs/proposals/PhD_Research_Proposal_Tran_Anh_Tuan.docx
+++ b/docs/proposals/PhD_Research_Proposal_Tran_Anh_Tuan.docx
@@ -4,498 +4,4354 @@
   <w:body>
     <w:p>
       <w:pPr>
-        <w:pStyle w:val="Title"/>
+        <w:spacing w:after="120"/>
       </w:pPr>
       <w:r>
         <w:rPr>
+          <w:rFonts w:ascii="Times New Roman" w:hAnsi="Times New Roman" w:eastAsia="Times New Roman"/>
+          <w:b/>
+          <w:i w:val="0"/>
           <w:color w:val="000000"/>
-          <w:sz w:val="50"/>
+          <w:sz w:val="32"/>
         </w:rPr>
-        <w:t>Reliable Time Series Forecasting with Evidence Grounded LLM Decision Support</w:t>
+        <w:t>Calibrated Forecast Uncertainty under Regime Change</w:t>
       </w:r>
     </w:p>
     <w:p>
-      <w:r/>
+      <w:pPr>
+        <w:spacing w:after="160" w:line="276" w:lineRule="auto"/>
+      </w:pPr>
       <w:r>
         <w:rPr>
-          <w:b/>
+          <w:rFonts w:ascii="Times New Roman" w:hAnsi="Times New Roman" w:eastAsia="Times New Roman"/>
+          <w:i w:val="0"/>
+          <w:color w:val="000000"/>
+          <w:sz w:val="24"/>
         </w:rPr>
-        <w:t>Proposed doctoral research · Trần Anh Tuân · 1 October 2026</w:t>
+        <w:t>Proposed doctoral research · Trần Anh Tuân · 7 October 2026</w:t>
       </w:r>
-      <w:r/>
     </w:p>
     <w:p>
       <w:pPr>
-        <w:pStyle w:val="Heading1"/>
+        <w:spacing w:after="160" w:line="276" w:lineRule="auto"/>
       </w:pPr>
       <w:r>
+        <w:rPr>
+          <w:rFonts w:ascii="Times New Roman" w:hAnsi="Times New Roman" w:eastAsia="Times New Roman"/>
+          <w:i w:val="0"/>
+          <w:color w:val="000000"/>
+          <w:sz w:val="24"/>
+        </w:rPr>
+        <w:t>[PhD_Research_Proposal_Tran_Anh_Tuan.docx](PhD_Research_Proposal_Tran_Anh_Tuan.docx).</w:t>
+      </w:r>
+    </w:p>
+    <w:p>
+      <w:pPr>
+        <w:spacing w:after="160" w:line="276" w:lineRule="auto"/>
+      </w:pPr>
+      <w:r>
+        <w:rPr>
+          <w:rFonts w:ascii="Times New Roman" w:hAnsi="Times New Roman" w:eastAsia="Times New Roman"/>
+          <w:i w:val="0"/>
+          <w:color w:val="000000"/>
+          <w:sz w:val="24"/>
+        </w:rPr>
+        <w:t>Numbers below are the committed run; the tables live in</w:t>
+      </w:r>
+    </w:p>
+    <w:p>
+      <w:pPr>
+        <w:spacing w:after="160" w:line="276" w:lineRule="auto"/>
+      </w:pPr>
+      <w:r>
+        <w:rPr>
+          <w:rFonts w:ascii="Times New Roman" w:hAnsi="Times New Roman" w:eastAsia="Times New Roman"/>
+          <w:i w:val="0"/>
+          <w:color w:val="000000"/>
+          <w:sz w:val="24"/>
+        </w:rPr>
+        <w:t>[preliminary results](../preliminary_results.md).</w:t>
+      </w:r>
+    </w:p>
+    <w:p>
+      <w:pPr>
+        <w:spacing w:before="240" w:after="80"/>
+      </w:pPr>
+      <w:r>
+        <w:rPr>
+          <w:rFonts w:ascii="Times New Roman" w:hAnsi="Times New Roman" w:eastAsia="Times New Roman"/>
+          <w:b/>
+          <w:i w:val="0"/>
+          <w:color w:val="000000"/>
+          <w:sz w:val="26"/>
+        </w:rPr>
         <w:t>Abstract</w:t>
       </w:r>
     </w:p>
     <w:p>
+      <w:pPr>
+        <w:spacing w:after="160" w:line="276" w:lineRule="auto"/>
+      </w:pPr>
       <w:r>
-        <w:t>Forecasts help organisations prepare for uncertain demand, market movements and operational conditions. A useful forecasting system must provide more than a plausible trajectory: it must quantify uncertainty, withstand changing conditions and communicate what the evidence supports. I propose to investigate a framework combining statistical and Bayesian models, Gaussian processes, gradient boosting and deep learning with an evidence-grounded large language model (LLM) reporting layer. The numerical models will produce forecasts and uncertainty estimates; the LLM will explain their implications using verified outputs and information available at the forecast origin. Initial experiments will focus on financial series and commercial demand. The research will evaluate numerical accuracy, interval calibration, robustness, explanation fidelity and decision costs separately. The intended contribution is an auditable method for translating uncertain forecasts into useful decision support, with empirical evidence identifying when the LLM layer helps and when it should abstain.</w:t>
+        <w:rPr>
+          <w:rFonts w:ascii="Times New Roman" w:hAnsi="Times New Roman" w:eastAsia="Times New Roman"/>
+          <w:i w:val="0"/>
+          <w:color w:val="000000"/>
+          <w:sz w:val="24"/>
+        </w:rPr>
+        <w:t>A useful forecast states a number and how much trust that number deserves when conditions</w:t>
       </w:r>
     </w:p>
     <w:p>
       <w:pPr>
-        <w:pStyle w:val="Heading1"/>
+        <w:spacing w:after="160" w:line="276" w:lineRule="auto"/>
       </w:pPr>
       <w:r>
-        <w:t>1 Motivation and research scope</w:t>
+        <w:rPr>
+          <w:rFonts w:ascii="Times New Roman" w:hAnsi="Times New Roman" w:eastAsia="Times New Roman"/>
+          <w:i w:val="0"/>
+          <w:color w:val="000000"/>
+          <w:sz w:val="24"/>
+        </w:rPr>
+        <w:t>change. I propose to study prediction intervals for financial returns under volatility regime</w:t>
       </w:r>
     </w:p>
     <w:p>
+      <w:pPr>
+        <w:spacing w:after="160" w:line="276" w:lineRule="auto"/>
+      </w:pPr>
       <w:r>
-        <w:t>Agriculture, manufacturing, technology, commerce and environmental monitoring all require estimates of future indicators. These estimates influence inventory, staffing, capacity allocation and contingency planning. However, these domains differ in frequency, seasonality, data availability and the costs of an incorrect decision. A universal model cannot be assumed to perform well across them.</w:t>
+        <w:rPr>
+          <w:rFonts w:ascii="Times New Roman" w:hAnsi="Times New Roman" w:eastAsia="Times New Roman"/>
+          <w:i w:val="0"/>
+          <w:color w:val="000000"/>
+          <w:sz w:val="24"/>
+        </w:rPr>
+        <w:t>change and, only after that result is stable, whether an evidence-checked report improves a</w:t>
       </w:r>
     </w:p>
     <w:p>
+      <w:pPr>
+        <w:spacing w:after="160" w:line="276" w:lineRule="auto"/>
+      </w:pPr>
       <w:r>
-        <w:t>My initial scope is deliberately limited to two contrasting settings: financial time series, including Bitcoin and the VN30 index, and commercial demand series. This builds on my forecasting experiments while allowing evaluation beyond finance. Energy, agriculture and weather will be possible extensions after the core framework is validated. Weather forecasting in particular requires physical and spatial information beyond a generic univariate forecasting pipeline.</w:t>
+        <w:rPr>
+          <w:rFonts w:ascii="Times New Roman" w:hAnsi="Times New Roman" w:eastAsia="Times New Roman"/>
+          <w:i w:val="0"/>
+          <w:color w:val="000000"/>
+          <w:sz w:val="24"/>
+        </w:rPr>
+        <w:t>decision relative to the same numbers in a fixed template. A completed preliminary study on the</w:t>
       </w:r>
     </w:p>
     <w:p>
+      <w:pPr>
+        <w:spacing w:after="160" w:line="276" w:lineRule="auto"/>
+      </w:pPr>
       <w:r>
-        <w:t>The central problem is how to connect reliable numerical forecasts with explanations and preparation options that remain faithful to the evidence. An articulate LLM report is not evidence of forecasting accuracy. Conversely, a lower numerical error does not necessarily improve a decision when uncertainty and asymmetric costs are ignored.</w:t>
+        <w:rPr>
+          <w:rFonts w:ascii="Times New Roman" w:hAnsi="Times New Roman" w:eastAsia="Times New Roman"/>
+          <w:i w:val="0"/>
+          <w:color w:val="000000"/>
+          <w:sz w:val="24"/>
+        </w:rPr>
+        <w:t>VN30 index and BIDV (BID), under a tested rolling-origin protocol, found that ridge regression,</w:t>
       </w:r>
     </w:p>
     <w:p>
       <w:pPr>
-        <w:pStyle w:val="Heading1"/>
+        <w:spacing w:after="160" w:line="276" w:lineRule="auto"/>
       </w:pPr>
       <w:r>
-        <w:t>2 Related work and proposed gap</w:t>
+        <w:rPr>
+          <w:rFonts w:ascii="Times New Roman" w:hAnsi="Times New Roman" w:eastAsia="Times New Roman"/>
+          <w:i w:val="0"/>
+          <w:color w:val="000000"/>
+          <w:sz w:val="24"/>
+        </w:rPr>
+        <w:t>extra-trees and gradient boosting do not beat persistence at a detectable level. Adaptive</w:t>
       </w:r>
     </w:p>
     <w:p>
+      <w:pPr>
+        <w:spacing w:after="160" w:line="276" w:lineRule="auto"/>
+      </w:pPr>
       <w:r>
-        <w:t>CatBoost provides gradient boosting techniques for categorical and numerical inputs [1]. Its use in this project will be as an established forecasting component with temporally valid feature construction, rather than a new learning algorithm. Gaussian processes and Bayesian state-space models offer alternative representations of uncertainty, while TensorFlow and Keras provide implementation tools for recurrent, convolutional and attention-based neural models.</w:t>
+        <w:rPr>
+          <w:rFonts w:ascii="Times New Roman" w:hAnsi="Times New Roman" w:eastAsia="Times New Roman"/>
+          <w:i w:val="0"/>
+          <w:color w:val="000000"/>
+          <w:sz w:val="24"/>
+        </w:rPr>
+        <w:t>conformal intervals kept marginal coverage within about one percentage point of the 80% and 95%</w:t>
       </w:r>
     </w:p>
     <w:p>
+      <w:pPr>
+        <w:spacing w:after="160" w:line="276" w:lineRule="auto"/>
+      </w:pPr>
       <w:r>
-        <w:t>Time-LLM adapts a frozen language model to produce time-series forecasts [2]. TimeSeriesScientist uses LLM agents for data preparation, planning, forecasting and reporting [3]. These works make clear that combining LLMs and time series is already an active research direction. Adaptive conformal inference offers a model-agnostic approach to updating uncertainty estimates under distribution shift [4].</w:t>
+        <w:rPr>
+          <w:rFonts w:ascii="Times New Roman" w:hAnsi="Times New Roman" w:eastAsia="Times New Roman"/>
+          <w:i w:val="0"/>
+          <w:color w:val="000000"/>
+          <w:sz w:val="24"/>
+        </w:rPr>
+        <w:t>targets. Static calibration over-covered, and volatility-normalised intervals failed</w:t>
       </w:r>
     </w:p>
     <w:p>
+      <w:pPr>
+        <w:spacing w:after="160" w:line="276" w:lineRule="auto"/>
+      </w:pPr>
       <w:r>
-        <w:t>The proposed gap is narrower than building another general forecasting agent: how should an LLM reporting layer communicate calibrated uncertainty, preserve temporal provenance and avoid unsupported claims when models disagree or conditions shift? I will examine whether verified reports improve decisions compared with identical numerical forecasts presented through a fixed template. This is a proposed research question, not a claim that existing work has never considered explanation or uncertainty. A fuller literature review will refine the distinction before methodological novelty is claimed.</w:t>
+        <w:rPr>
+          <w:rFonts w:ascii="Times New Roman" w:hAnsi="Times New Roman" w:eastAsia="Times New Roman"/>
+          <w:i w:val="0"/>
+          <w:color w:val="000000"/>
+          <w:sz w:val="24"/>
+        </w:rPr>
+        <w:t>conditionally: they under-covered calm periods and over-covered turbulent ones. The doctoral</w:t>
       </w:r>
     </w:p>
     <w:p>
       <w:pPr>
-        <w:pStyle w:val="Heading1"/>
+        <w:spacing w:after="160" w:line="276" w:lineRule="auto"/>
       </w:pPr>
       <w:r>
-        <w:t>3 Research questions and hypotheses</w:t>
+        <w:rPr>
+          <w:rFonts w:ascii="Times New Roman" w:hAnsi="Times New Roman" w:eastAsia="Times New Roman"/>
+          <w:i w:val="0"/>
+          <w:color w:val="000000"/>
+          <w:sz w:val="24"/>
+        </w:rPr>
+        <w:t>project treats that negative point-forecast result as a baseline. The intended contribution is</w:t>
       </w:r>
     </w:p>
     <w:p>
-      <w:r/>
+      <w:pPr>
+        <w:spacing w:after="160" w:line="276" w:lineRule="auto"/>
+      </w:pPr>
       <w:r>
         <w:rPr>
+          <w:rFonts w:ascii="Times New Roman" w:hAnsi="Times New Roman" w:eastAsia="Times New Roman"/>
+          <w:i w:val="0"/>
+          <w:color w:val="000000"/>
+          <w:sz w:val="24"/>
+        </w:rPr>
+        <w:t>a calibration method whose coverage holds inside regimes, not only on average, and a later</w:t>
+      </w:r>
+    </w:p>
+    <w:p>
+      <w:pPr>
+        <w:spacing w:after="160" w:line="276" w:lineRule="auto"/>
+      </w:pPr>
+      <w:r>
+        <w:rPr>
+          <w:rFonts w:ascii="Times New Roman" w:hAnsi="Times New Roman" w:eastAsia="Times New Roman"/>
+          <w:i w:val="0"/>
+          <w:color w:val="000000"/>
+          <w:sz w:val="24"/>
+        </w:rPr>
+        <w:t>reporting layer that cannot state a number the evidence packet does not contain.</w:t>
+      </w:r>
+    </w:p>
+    <w:p>
+      <w:pPr>
+        <w:spacing w:before="240" w:after="80"/>
+      </w:pPr>
+      <w:r>
+        <w:rPr>
+          <w:rFonts w:ascii="Times New Roman" w:hAnsi="Times New Roman" w:eastAsia="Times New Roman"/>
           <w:b/>
+          <w:i w:val="0"/>
+          <w:color w:val="000000"/>
+          <w:sz w:val="26"/>
+        </w:rPr>
+        <w:t>1. Problem</w:t>
+      </w:r>
+    </w:p>
+    <w:p>
+      <w:pPr>
+        <w:spacing w:after="160" w:line="276" w:lineRule="auto"/>
+      </w:pPr>
+      <w:r>
+        <w:rPr>
+          <w:rFonts w:ascii="Times New Roman" w:hAnsi="Times New Roman" w:eastAsia="Times New Roman"/>
+          <w:i w:val="0"/>
+          <w:color w:val="000000"/>
+          <w:sz w:val="24"/>
+        </w:rPr>
+        <w:t>Inventory, staffing and risk limits depend on forecasts. For daily financial returns the hard</w:t>
+      </w:r>
+    </w:p>
+    <w:p>
+      <w:pPr>
+        <w:spacing w:after="160" w:line="276" w:lineRule="auto"/>
+      </w:pPr>
+      <w:r>
+        <w:rPr>
+          <w:rFonts w:ascii="Times New Roman" w:hAnsi="Times New Roman" w:eastAsia="Times New Roman"/>
+          <w:i w:val="0"/>
+          <w:color w:val="000000"/>
+          <w:sz w:val="24"/>
+        </w:rPr>
+        <w:t>part is often not the point forecast. Persistence, a predicted log return of zero, is already</w:t>
+      </w:r>
+    </w:p>
+    <w:p>
+      <w:pPr>
+        <w:spacing w:after="160" w:line="276" w:lineRule="auto"/>
+      </w:pPr>
+      <w:r>
+        <w:rPr>
+          <w:rFonts w:ascii="Times New Roman" w:hAnsi="Times New Roman" w:eastAsia="Times New Roman"/>
+          <w:i w:val="0"/>
+          <w:color w:val="000000"/>
+          <w:sz w:val="24"/>
+        </w:rPr>
+        <w:t>difficult to beat, and a small error in the price level can look like skill when it only</w:t>
+      </w:r>
+    </w:p>
+    <w:p>
+      <w:pPr>
+        <w:spacing w:after="160" w:line="276" w:lineRule="auto"/>
+      </w:pPr>
+      <w:r>
+        <w:rPr>
+          <w:rFonts w:ascii="Times New Roman" w:hAnsi="Times New Roman" w:eastAsia="Times New Roman"/>
+          <w:i w:val="0"/>
+          <w:color w:val="000000"/>
+          <w:sz w:val="24"/>
+        </w:rPr>
+        <w:t>reflects that level. What remains useful is uncertainty that stays calibrated when volatility</w:t>
+      </w:r>
+    </w:p>
+    <w:p>
+      <w:pPr>
+        <w:spacing w:after="160" w:line="276" w:lineRule="auto"/>
+      </w:pPr>
+      <w:r>
+        <w:rPr>
+          <w:rFonts w:ascii="Times New Roman" w:hAnsi="Times New Roman" w:eastAsia="Times New Roman"/>
+          <w:i w:val="0"/>
+          <w:color w:val="000000"/>
+          <w:sz w:val="24"/>
+        </w:rPr>
+        <w:t>shifts, and a report that does not add claims the numbers do not support.</w:t>
+      </w:r>
+    </w:p>
+    <w:p>
+      <w:pPr>
+        <w:spacing w:after="160" w:line="276" w:lineRule="auto"/>
+      </w:pPr>
+      <w:r>
+        <w:rPr>
+          <w:rFonts w:ascii="Times New Roman" w:hAnsi="Times New Roman" w:eastAsia="Times New Roman"/>
+          <w:i w:val="0"/>
+          <w:color w:val="000000"/>
+          <w:sz w:val="24"/>
+        </w:rPr>
+        <w:t>The first empirical scope is daily VN30 and BID, where a protocol and a negative baseline</w:t>
+      </w:r>
+    </w:p>
+    <w:p>
+      <w:pPr>
+        <w:spacing w:after="160" w:line="276" w:lineRule="auto"/>
+      </w:pPr>
+      <w:r>
+        <w:rPr>
+          <w:rFonts w:ascii="Times New Roman" w:hAnsi="Times New Roman" w:eastAsia="Times New Roman"/>
+          <w:i w:val="0"/>
+          <w:color w:val="000000"/>
+          <w:sz w:val="24"/>
+        </w:rPr>
+        <w:t>already exist. A public demand benchmark is a later domain. Energy, agriculture and weather</w:t>
+      </w:r>
+    </w:p>
+    <w:p>
+      <w:pPr>
+        <w:spacing w:after="160" w:line="276" w:lineRule="auto"/>
+      </w:pPr>
+      <w:r>
+        <w:rPr>
+          <w:rFonts w:ascii="Times New Roman" w:hAnsi="Times New Roman" w:eastAsia="Times New Roman"/>
+          <w:i w:val="0"/>
+          <w:color w:val="000000"/>
+          <w:sz w:val="24"/>
+        </w:rPr>
+        <w:t>are out of scope. Realised trading profit is not an objective.</w:t>
+      </w:r>
+    </w:p>
+    <w:p>
+      <w:pPr>
+        <w:spacing w:before="240" w:after="80"/>
+      </w:pPr>
+      <w:r>
+        <w:rPr>
+          <w:rFonts w:ascii="Times New Roman" w:hAnsi="Times New Roman" w:eastAsia="Times New Roman"/>
+          <w:b/>
+          <w:i w:val="0"/>
+          <w:color w:val="000000"/>
+          <w:sz w:val="26"/>
+        </w:rPr>
+        <w:t>2. Related work and the gap</w:t>
+      </w:r>
+    </w:p>
+    <w:p>
+      <w:pPr>
+        <w:spacing w:after="160" w:line="276" w:lineRule="auto"/>
+      </w:pPr>
+      <w:r>
+        <w:rPr>
+          <w:rFonts w:ascii="Times New Roman" w:hAnsi="Times New Roman" w:eastAsia="Times New Roman"/>
+          <w:i w:val="0"/>
+          <w:color w:val="000000"/>
+          <w:sz w:val="24"/>
+        </w:rPr>
+        <w:t>Accuracy is judged against a simple benchmark, with a scale-free metric such as MASE [1].</w:t>
+      </w:r>
+    </w:p>
+    <w:p>
+      <w:pPr>
+        <w:spacing w:after="160" w:line="276" w:lineRule="auto"/>
+      </w:pPr>
+      <w:r>
+        <w:rPr>
+          <w:rFonts w:ascii="Times New Roman" w:hAnsi="Times New Roman" w:eastAsia="Times New Roman"/>
+          <w:i w:val="0"/>
+          <w:color w:val="000000"/>
+          <w:sz w:val="24"/>
+        </w:rPr>
+        <w:t>Diebold and Mariano [2], with the correction of Harvey, Leybourne and Newbold [3], test</w:t>
+      </w:r>
+    </w:p>
+    <w:p>
+      <w:pPr>
+        <w:spacing w:after="160" w:line="276" w:lineRule="auto"/>
+      </w:pPr>
+      <w:r>
+        <w:rPr>
+          <w:rFonts w:ascii="Times New Roman" w:hAnsi="Times New Roman" w:eastAsia="Times New Roman"/>
+          <w:i w:val="0"/>
+          <w:color w:val="000000"/>
+          <w:sz w:val="24"/>
+        </w:rPr>
+        <w:t>whether a loss difference exceeds noise when errors are dependent. Rolling-origin evaluation,</w:t>
+      </w:r>
+    </w:p>
+    <w:p>
+      <w:pPr>
+        <w:spacing w:after="160" w:line="276" w:lineRule="auto"/>
+      </w:pPr>
+      <w:r>
+        <w:rPr>
+          <w:rFonts w:ascii="Times New Roman" w:hAnsi="Times New Roman" w:eastAsia="Times New Roman"/>
+          <w:i w:val="0"/>
+          <w:color w:val="000000"/>
+          <w:sz w:val="24"/>
+        </w:rPr>
+        <w:t>not a random split, is the right design [4, 5]. M4 and M5 showed that rankings depend on the</w:t>
+      </w:r>
+    </w:p>
+    <w:p>
+      <w:pPr>
+        <w:spacing w:after="160" w:line="276" w:lineRule="auto"/>
+      </w:pPr>
+      <w:r>
+        <w:rPr>
+          <w:rFonts w:ascii="Times New Roman" w:hAnsi="Times New Roman" w:eastAsia="Times New Roman"/>
+          <w:i w:val="0"/>
+          <w:color w:val="000000"/>
+          <w:sz w:val="24"/>
+        </w:rPr>
+        <w:t>loss, the horizon and the series, and that simple methods remain competitive [6, 7].</w:t>
+      </w:r>
+    </w:p>
+    <w:p>
+      <w:pPr>
+        <w:spacing w:after="160" w:line="276" w:lineRule="auto"/>
+      </w:pPr>
+      <w:r>
+        <w:rPr>
+          <w:rFonts w:ascii="Times New Roman" w:hAnsi="Times New Roman" w:eastAsia="Times New Roman"/>
+          <w:i w:val="0"/>
+          <w:color w:val="000000"/>
+          <w:sz w:val="24"/>
+        </w:rPr>
+        <w:t>Distribution-free intervals need not assume that the whole sample is exchangeable.</w:t>
+      </w:r>
+    </w:p>
+    <w:p>
+      <w:pPr>
+        <w:spacing w:after="160" w:line="276" w:lineRule="auto"/>
+      </w:pPr>
+      <w:r>
+        <w:rPr>
+          <w:rFonts w:ascii="Times New Roman" w:hAnsi="Times New Roman" w:eastAsia="Times New Roman"/>
+          <w:i w:val="0"/>
+          <w:color w:val="000000"/>
+          <w:sz w:val="24"/>
+        </w:rPr>
+        <w:t>Conformalised quantile regression [8], conformal prediction beyond exchangeability [9], EnbPI</w:t>
+      </w:r>
+    </w:p>
+    <w:p>
+      <w:pPr>
+        <w:spacing w:after="160" w:line="276" w:lineRule="auto"/>
+      </w:pPr>
+      <w:r>
+        <w:rPr>
+          <w:rFonts w:ascii="Times New Roman" w:hAnsi="Times New Roman" w:eastAsia="Times New Roman"/>
+          <w:i w:val="0"/>
+          <w:color w:val="000000"/>
+          <w:sz w:val="24"/>
+        </w:rPr>
+        <w:t>[10] and conformal time-series forecasting [11] target marginal coverage under dependence or</w:t>
+      </w:r>
+    </w:p>
+    <w:p>
+      <w:pPr>
+        <w:spacing w:after="160" w:line="276" w:lineRule="auto"/>
+      </w:pPr>
+      <w:r>
+        <w:rPr>
+          <w:rFonts w:ascii="Times New Roman" w:hAnsi="Times New Roman" w:eastAsia="Times New Roman"/>
+          <w:i w:val="0"/>
+          <w:color w:val="000000"/>
+          <w:sz w:val="24"/>
+        </w:rPr>
+        <w:t>weighted exchangeability. Adaptive conformal inference updates the miscoverage level online</w:t>
+      </w:r>
+    </w:p>
+    <w:p>
+      <w:pPr>
+        <w:spacing w:after="160" w:line="276" w:lineRule="auto"/>
+      </w:pPr>
+      <w:r>
+        <w:rPr>
+          <w:rFonts w:ascii="Times New Roman" w:hAnsi="Times New Roman" w:eastAsia="Times New Roman"/>
+          <w:i w:val="0"/>
+          <w:color w:val="000000"/>
+          <w:sz w:val="24"/>
+        </w:rPr>
+        <w:t>when the distribution shifts [12]. Coverage alone is not enough: an interval score penalises</w:t>
+      </w:r>
+    </w:p>
+    <w:p>
+      <w:pPr>
+        <w:spacing w:after="160" w:line="276" w:lineRule="auto"/>
+      </w:pPr>
+      <w:r>
+        <w:rPr>
+          <w:rFonts w:ascii="Times New Roman" w:hAnsi="Times New Roman" w:eastAsia="Times New Roman"/>
+          <w:i w:val="0"/>
+          <w:color w:val="000000"/>
+          <w:sz w:val="24"/>
+        </w:rPr>
+        <w:t>width, so a method cannot win by making every interval arbitrarily wide [13].</w:t>
+      </w:r>
+    </w:p>
+    <w:p>
+      <w:pPr>
+        <w:spacing w:after="160" w:line="276" w:lineRule="auto"/>
+      </w:pPr>
+      <w:r>
+        <w:rPr>
+          <w:rFonts w:ascii="Times New Roman" w:hAnsi="Times New Roman" w:eastAsia="Times New Roman"/>
+          <w:i w:val="0"/>
+          <w:color w:val="000000"/>
+          <w:sz w:val="24"/>
+        </w:rPr>
+        <w:t>Pretrained time-series models transfer across datasets in zero-shot benchmarks [14, 15, 16].</w:t>
+      </w:r>
+    </w:p>
+    <w:p>
+      <w:pPr>
+        <w:spacing w:after="160" w:line="276" w:lineRule="auto"/>
+      </w:pPr>
+      <w:r>
+        <w:rPr>
+          <w:rFonts w:ascii="Times New Roman" w:hAnsi="Times New Roman" w:eastAsia="Times New Roman"/>
+          <w:i w:val="0"/>
+          <w:color w:val="000000"/>
+          <w:sz w:val="24"/>
+        </w:rPr>
+        <w:t>Time-LLM reprograms a frozen language model to emit forecasts [17]. A direct ablation found</w:t>
+      </w:r>
+    </w:p>
+    <w:p>
+      <w:pPr>
+        <w:spacing w:after="160" w:line="276" w:lineRule="auto"/>
+      </w:pPr>
+      <w:r>
+        <w:rPr>
+          <w:rFonts w:ascii="Times New Roman" w:hAnsi="Times New Roman" w:eastAsia="Times New Roman"/>
+          <w:i w:val="0"/>
+          <w:color w:val="000000"/>
+          <w:sz w:val="24"/>
+        </w:rPr>
+        <w:t>that, for point forecasting, removing the language-model component often did not hurt and</w:t>
+      </w:r>
+    </w:p>
+    <w:p>
+      <w:pPr>
+        <w:spacing w:after="160" w:line="276" w:lineRule="auto"/>
+      </w:pPr>
+      <w:r>
+        <w:rPr>
+          <w:rFonts w:ascii="Times New Roman" w:hAnsi="Times New Roman" w:eastAsia="Times New Roman"/>
+          <w:i w:val="0"/>
+          <w:color w:val="000000"/>
+          <w:sz w:val="24"/>
+        </w:rPr>
+        <w:t>sometimes helped [18]. That is why this proposal does not treat a language model as a</w:t>
+      </w:r>
+    </w:p>
+    <w:p>
+      <w:pPr>
+        <w:spacing w:after="160" w:line="276" w:lineRule="auto"/>
+      </w:pPr>
+      <w:r>
+        <w:rPr>
+          <w:rFonts w:ascii="Times New Roman" w:hAnsi="Times New Roman" w:eastAsia="Times New Roman"/>
+          <w:i w:val="0"/>
+          <w:color w:val="000000"/>
+          <w:sz w:val="24"/>
+        </w:rPr>
+        <w:t>forecasting engine. The open question is narrower: once a numerical forecast and an interval</w:t>
+      </w:r>
+    </w:p>
+    <w:p>
+      <w:pPr>
+        <w:spacing w:after="160" w:line="276" w:lineRule="auto"/>
+      </w:pPr>
+      <w:r>
+        <w:rPr>
+          <w:rFonts w:ascii="Times New Roman" w:hAnsi="Times New Roman" w:eastAsia="Times New Roman"/>
+          <w:i w:val="0"/>
+          <w:color w:val="000000"/>
+          <w:sz w:val="24"/>
+        </w:rPr>
+        <w:t>exist, can a constrained report communicate them without unsupported numbers, and does that</w:t>
+      </w:r>
+    </w:p>
+    <w:p>
+      <w:pPr>
+        <w:spacing w:after="160" w:line="276" w:lineRule="auto"/>
+      </w:pPr>
+      <w:r>
+        <w:rPr>
+          <w:rFonts w:ascii="Times New Roman" w:hAnsi="Times New Roman" w:eastAsia="Times New Roman"/>
+          <w:i w:val="0"/>
+          <w:color w:val="000000"/>
+          <w:sz w:val="24"/>
+        </w:rPr>
+        <w:t>communication change a decision [19]?</w:t>
+      </w:r>
+    </w:p>
+    <w:p>
+      <w:pPr>
+        <w:spacing w:after="160" w:line="276" w:lineRule="auto"/>
+      </w:pPr>
+      <w:r>
+        <w:rPr>
+          <w:rFonts w:ascii="Times New Roman" w:hAnsi="Times New Roman" w:eastAsia="Times New Roman"/>
+          <w:i w:val="0"/>
+          <w:color w:val="000000"/>
+          <w:sz w:val="24"/>
+        </w:rPr>
+        <w:t>The gap is conditional coverage. Existing conformal methods are typically judged on marginal</w:t>
+      </w:r>
+    </w:p>
+    <w:p>
+      <w:pPr>
+        <w:spacing w:after="160" w:line="276" w:lineRule="auto"/>
+      </w:pPr>
+      <w:r>
+        <w:rPr>
+          <w:rFonts w:ascii="Times New Roman" w:hAnsi="Times New Roman" w:eastAsia="Times New Roman"/>
+          <w:i w:val="0"/>
+          <w:color w:val="000000"/>
+          <w:sz w:val="24"/>
+        </w:rPr>
+        <w:t>coverage. The preliminary run shows that marginal coverage can sit on the nominal level while</w:t>
+      </w:r>
+    </w:p>
+    <w:p>
+      <w:pPr>
+        <w:spacing w:after="160" w:line="276" w:lineRule="auto"/>
+      </w:pPr>
+      <w:r>
+        <w:rPr>
+          <w:rFonts w:ascii="Times New Roman" w:hAnsi="Times New Roman" w:eastAsia="Times New Roman"/>
+          <w:i w:val="0"/>
+          <w:color w:val="000000"/>
+          <w:sz w:val="24"/>
+        </w:rPr>
+        <w:t>coverage inside volatility regimes does not. The thesis studies horizon-specific sequential</w:t>
+      </w:r>
+    </w:p>
+    <w:p>
+      <w:pPr>
+        <w:spacing w:after="160" w:line="276" w:lineRule="auto"/>
+      </w:pPr>
+      <w:r>
+        <w:rPr>
+          <w:rFonts w:ascii="Times New Roman" w:hAnsi="Times New Roman" w:eastAsia="Times New Roman"/>
+          <w:i w:val="0"/>
+          <w:color w:val="000000"/>
+          <w:sz w:val="24"/>
+        </w:rPr>
+        <w:t>calibration aimed at that failure, and only then a reporting layer whose numerical claims are</w:t>
+      </w:r>
+    </w:p>
+    <w:p>
+      <w:pPr>
+        <w:spacing w:after="160" w:line="276" w:lineRule="auto"/>
+      </w:pPr>
+      <w:r>
+        <w:rPr>
+          <w:rFonts w:ascii="Times New Roman" w:hAnsi="Times New Roman" w:eastAsia="Times New Roman"/>
+          <w:i w:val="0"/>
+          <w:color w:val="000000"/>
+          <w:sz w:val="24"/>
+        </w:rPr>
+        <w:t>checked by code against an evidence packet available at the forecast origin.</w:t>
+      </w:r>
+    </w:p>
+    <w:p>
+      <w:pPr>
+        <w:spacing w:before="240" w:after="80"/>
+      </w:pPr>
+      <w:r>
+        <w:rPr>
+          <w:rFonts w:ascii="Times New Roman" w:hAnsi="Times New Roman" w:eastAsia="Times New Roman"/>
+          <w:b/>
+          <w:i w:val="0"/>
+          <w:color w:val="000000"/>
+          <w:sz w:val="26"/>
+        </w:rPr>
+        <w:t>3. Research questions</w:t>
+      </w:r>
+    </w:p>
+    <w:p>
+      <w:pPr>
+        <w:spacing w:after="160" w:line="276" w:lineRule="auto"/>
+      </w:pPr>
+      <w:r>
+        <w:rPr>
+          <w:rFonts w:ascii="Times New Roman" w:hAnsi="Times New Roman" w:eastAsia="Times New Roman"/>
+          <w:b/>
+          <w:color w:val="000000"/>
+          <w:sz w:val="24"/>
         </w:rPr>
         <w:t>RQ1.</w:t>
       </w:r>
       <w:r>
-        <w:t xml:space="preserve"> Under which conditions do statistical, Bayesian, gradient-boosting and neural models improve on persistence and seasonal baselines across forecast horizons? The working hypothesis is that relative performance depends on horizon, seasonality, sample size and regime; no family will consistently dominate.</w:t>
+        <w:rPr>
+          <w:rFonts w:ascii="Times New Roman" w:hAnsi="Times New Roman" w:eastAsia="Times New Roman"/>
+          <w:i w:val="0"/>
+          <w:color w:val="000000"/>
+          <w:sz w:val="24"/>
+        </w:rPr>
+        <w:t xml:space="preserve"> Can sequential, horizon-specific calibration keep both marginal coverage and coverage</w:t>
       </w:r>
     </w:p>
     <w:p>
-      <w:r/>
+      <w:pPr>
+        <w:spacing w:after="160" w:line="276" w:lineRule="auto"/>
+      </w:pPr>
       <w:r>
         <w:rPr>
+          <w:rFonts w:ascii="Times New Roman" w:hAnsi="Times New Roman" w:eastAsia="Times New Roman"/>
+          <w:i w:val="0"/>
+          <w:color w:val="000000"/>
+          <w:sz w:val="24"/>
+        </w:rPr>
+        <w:t>inside predefined volatility regimes when those regimes change, at a width that remains useful?</w:t>
+      </w:r>
+    </w:p>
+    <w:p>
+      <w:pPr>
+        <w:spacing w:after="160" w:line="276" w:lineRule="auto"/>
+      </w:pPr>
+      <w:r>
+        <w:rPr>
+          <w:rFonts w:ascii="Times New Roman" w:hAnsi="Times New Roman" w:eastAsia="Times New Roman"/>
+          <w:i w:val="0"/>
+          <w:color w:val="000000"/>
+          <w:sz w:val="24"/>
+        </w:rPr>
+        <w:t>The working hypothesis is that adaptation reduces persistent over- or under-coverage relative</w:t>
+      </w:r>
+    </w:p>
+    <w:p>
+      <w:pPr>
+        <w:spacing w:after="160" w:line="276" w:lineRule="auto"/>
+      </w:pPr>
+      <w:r>
+        <w:rPr>
+          <w:rFonts w:ascii="Times New Roman" w:hAnsi="Times New Roman" w:eastAsia="Times New Roman"/>
+          <w:i w:val="0"/>
+          <w:color w:val="000000"/>
+          <w:sz w:val="24"/>
+        </w:rPr>
+        <w:t>to a static split, but a volatility scale fitted on an earlier regime can over-correct.</w:t>
+      </w:r>
+    </w:p>
+    <w:p>
+      <w:pPr>
+        <w:spacing w:after="160" w:line="276" w:lineRule="auto"/>
+      </w:pPr>
+      <w:r>
+        <w:rPr>
+          <w:rFonts w:ascii="Times New Roman" w:hAnsi="Times New Roman" w:eastAsia="Times New Roman"/>
+          <w:i w:val="0"/>
+          <w:color w:val="000000"/>
+          <w:sz w:val="24"/>
+        </w:rPr>
+        <w:t>Negative results will be reported.</w:t>
+      </w:r>
+    </w:p>
+    <w:p>
+      <w:pPr>
+        <w:spacing w:after="160" w:line="276" w:lineRule="auto"/>
+      </w:pPr>
+      <w:r>
+        <w:rPr>
+          <w:rFonts w:ascii="Times New Roman" w:hAnsi="Times New Roman" w:eastAsia="Times New Roman"/>
           <w:b/>
+          <w:color w:val="000000"/>
+          <w:sz w:val="24"/>
         </w:rPr>
         <w:t>RQ2.</w:t>
       </w:r>
       <w:r>
-        <w:t xml:space="preserve"> Can horizon-specific, adaptive uncertainty calibration improve coverage and interval quality during changing conditions? The hypothesis is that adaptation can reduce persistent coverage errors, with a trade-off in interval width and performance during abrupt shifts.</w:t>
+        <w:rPr>
+          <w:rFonts w:ascii="Times New Roman" w:hAnsi="Times New Roman" w:eastAsia="Times New Roman"/>
+          <w:i w:val="0"/>
+          <w:color w:val="000000"/>
+          <w:sz w:val="24"/>
+        </w:rPr>
+        <w:t xml:space="preserve"> Can a schema, source timestamps and a deterministic numerical check reduce unsupported</w:t>
       </w:r>
     </w:p>
     <w:p>
-      <w:r/>
+      <w:pPr>
+        <w:spacing w:after="160" w:line="276" w:lineRule="auto"/>
+      </w:pPr>
       <w:r>
         <w:rPr>
-          <w:b/>
+          <w:rFonts w:ascii="Times New Roman" w:hAnsi="Times New Roman" w:eastAsia="Times New Roman"/>
+          <w:i w:val="0"/>
+          <w:color w:val="000000"/>
+          <w:sz w:val="24"/>
         </w:rPr>
-        <w:t>RQ3.</w:t>
-      </w:r>
-      <w:r>
-        <w:t xml:space="preserve"> Can structured evidence and numerical verification reduce unsupported statements in LLM forecast reports? The hypothesis is that constrained reporting and explicit abstention will improve fidelity compared with unconstrained narrative generation.</w:t>
+        <w:t>statements relative to an unconstrained report, and does a verified report change cost in a</w:t>
       </w:r>
     </w:p>
     <w:p>
-      <w:r/>
+      <w:pPr>
+        <w:spacing w:after="160" w:line="276" w:lineRule="auto"/>
+      </w:pPr>
       <w:r>
         <w:rPr>
-          <w:b/>
+          <w:rFonts w:ascii="Times New Roman" w:hAnsi="Times New Roman" w:eastAsia="Times New Roman"/>
+          <w:i w:val="0"/>
+          <w:color w:val="000000"/>
+          <w:sz w:val="24"/>
         </w:rPr>
-        <w:t>RQ4.</w:t>
-      </w:r>
-      <w:r>
-        <w:t xml:space="preserve"> Does an evidence-grounded report improve decision quality beyond the same forecasts and intervals shown in a fixed template? The hypothesis is that contextual explanations may help under ambiguity, but may offer little value for simple decisions or introduce overconfidence. Negative results will be reported.</w:t>
+        <w:t>fixed inventory simulation relative to a template that shows the same forecast distribution?</w:t>
       </w:r>
     </w:p>
     <w:p>
       <w:pPr>
-        <w:pStyle w:val="Heading1"/>
+        <w:spacing w:after="160" w:line="276" w:lineRule="auto"/>
       </w:pPr>
       <w:r>
-        <w:t>4 Proposed framework</w:t>
+        <w:rPr>
+          <w:rFonts w:ascii="Times New Roman" w:hAnsi="Times New Roman" w:eastAsia="Times New Roman"/>
+          <w:i w:val="0"/>
+          <w:color w:val="000000"/>
+          <w:sz w:val="24"/>
+        </w:rPr>
+        <w:t>The working hypothesis is that verification will cut unsupported numbers, while decision value</w:t>
       </w:r>
     </w:p>
     <w:p>
       <w:pPr>
-        <w:pStyle w:val="Heading2"/>
+        <w:spacing w:after="160" w:line="276" w:lineRule="auto"/>
       </w:pPr>
       <w:r>
-        <w:t>4.1 Forecasting and model comparison</w:t>
+        <w:rPr>
+          <w:rFonts w:ascii="Times New Roman" w:hAnsi="Times New Roman" w:eastAsia="Times New Roman"/>
+          <w:i w:val="0"/>
+          <w:color w:val="000000"/>
+          <w:sz w:val="24"/>
+        </w:rPr>
+        <w:t>may be small once the numbers are already shown. The language model is not scored as a</w:t>
       </w:r>
     </w:p>
     <w:p>
+      <w:pPr>
+        <w:spacing w:after="160" w:line="276" w:lineRule="auto"/>
+      </w:pPr>
       <w:r>
-        <w:t>Each experiment will define a target, an observation calendar, a forecast origin, a horizon and an information set. Baselines will include persistence, drift, seasonal naive, exponential smoothing and ARIMA where appropriate. Candidate models will include Bayesian state-space or regression models, Gaussian process regression, CatBoost with lagged and calendar features, and a limited set of TensorFlow/Keras models such as LSTM and temporal convolutional networks. A patch-based attention model will be added only if the data and compute budget justify it. Gaussian processes will use a sparse approximation or bounded training window for long series.</w:t>
+        <w:rPr>
+          <w:rFonts w:ascii="Times New Roman" w:hAnsi="Times New Roman" w:eastAsia="Times New Roman"/>
+          <w:i w:val="0"/>
+          <w:color w:val="000000"/>
+          <w:sz w:val="24"/>
+        </w:rPr>
+        <w:t>forecaster [18].</w:t>
       </w:r>
     </w:p>
     <w:p>
+      <w:pPr>
+        <w:spacing w:after="160" w:line="276" w:lineRule="auto"/>
+      </w:pPr>
       <w:r>
-        <w:t>Model selection will use validation data and a fixed compute budget. A validation-selected individual model and a simple ensemble will precede any adaptive ensemble. Proposed ensemble weights will depend on past realised errors and uncertainty diagnostics, never future test outcomes. Feature importance and residual diagnostics will be described as predictive evidence, not causal explanations.</w:t>
+        <w:rPr>
+          <w:rFonts w:ascii="Times New Roman" w:hAnsi="Times New Roman" w:eastAsia="Times New Roman"/>
+          <w:i w:val="0"/>
+          <w:color w:val="000000"/>
+          <w:sz w:val="24"/>
+        </w:rPr>
+        <w:t>These two questions are the thesis. Comparing further model families, including models from the</w:t>
       </w:r>
     </w:p>
     <w:p>
       <w:pPr>
-        <w:pStyle w:val="Heading2"/>
+        <w:spacing w:after="160" w:line="276" w:lineRule="auto"/>
       </w:pPr>
       <w:r>
-        <w:t>4.2 Uncertainty and temporal calibration</w:t>
+        <w:rPr>
+          <w:rFonts w:ascii="Times New Roman" w:hAnsi="Times New Roman" w:eastAsia="Times New Roman"/>
+          <w:i w:val="0"/>
+          <w:color w:val="000000"/>
+          <w:sz w:val="24"/>
+        </w:rPr>
+        <w:t>archived notebooks, is supporting work under the same protocol. A human study needs ethics</w:t>
       </w:r>
     </w:p>
     <w:p>
+      <w:pPr>
+        <w:spacing w:after="160" w:line="276" w:lineRule="auto"/>
+      </w:pPr>
       <w:r>
-        <w:t>Candidate uncertainty estimates will include posterior predictive intervals, quantile regression and residual-based intervals. Sequential calibration will be applied by horizon using only forecast errors whose outcomes have become observable. Adaptive conformal inference [4] will be compared with a rolling calibration baseline. Coverage, width and interval scores will be evaluated together. The proposal does not assume that nominal coverage holds conditionally for every regime or every horizon under arbitrary dependence; the applicable assumptions and empirical failures will be documented.</w:t>
+        <w:rPr>
+          <w:rFonts w:ascii="Times New Roman" w:hAnsi="Times New Roman" w:eastAsia="Times New Roman"/>
+          <w:i w:val="0"/>
+          <w:color w:val="000000"/>
+          <w:sz w:val="24"/>
+        </w:rPr>
+        <w:t>approval and is not required for the minimum thesis.</w:t>
       </w:r>
     </w:p>
     <w:p>
       <w:pPr>
-        <w:pStyle w:val="Heading2"/>
+        <w:spacing w:before="240" w:after="80"/>
       </w:pPr>
       <w:r>
-        <w:t>4.3 Evidence-grounded LLM reporting</w:t>
+        <w:rPr>
+          <w:rFonts w:ascii="Times New Roman" w:hAnsi="Times New Roman" w:eastAsia="Times New Roman"/>
+          <w:b/>
+          <w:i w:val="0"/>
+          <w:color w:val="000000"/>
+          <w:sz w:val="26"/>
+        </w:rPr>
+        <w:t>4. Preliminary evidence</w:t>
       </w:r>
     </w:p>
     <w:p>
+      <w:pPr>
+        <w:spacing w:after="160" w:line="276" w:lineRule="auto"/>
+      </w:pPr>
       <w:r>
-        <w:t>The reporting layer will receive a structured evidence packet: target definition, origin timestamp, forecast values, interval bounds, historical model errors, diagnostic flags, model disagreement and approved decision constraints. Optional contextual documents must have been available at that origin and will carry source identifiers and publication timestamps. Future observations, revised data and later news will be excluded.</w:t>
+        <w:rPr>
+          <w:rFonts w:ascii="Times New Roman" w:hAnsi="Times New Roman" w:eastAsia="Times New Roman"/>
+          <w:i w:val="0"/>
+          <w:color w:val="000000"/>
+          <w:sz w:val="24"/>
+        </w:rPr>
+        <w:t>The public repository implements the protocol and stores a completed run. Result tables are</w:t>
       </w:r>
     </w:p>
     <w:p>
+      <w:pPr>
+        <w:spacing w:after="160" w:line="276" w:lineRule="auto"/>
+      </w:pPr>
       <w:r>
-        <w:t>The LLM will generate a structured report covering the forecast, uncertainty, supporting evidence, scenarios and conditions for abstaining. Numerical statements will be checked against the evidence packet by deterministic code. A schema will require evidence identifiers for factual claims. Unsupported numbers or missing sources will trigger regeneration or a fixed-template fallback. The LLM will not silently alter numerical forecasts. Any forecast revision based on text will be a separately evaluated extension.</w:t>
+        <w:rPr>
+          <w:rFonts w:ascii="Times New Roman" w:hAnsi="Times New Roman" w:eastAsia="Times New Roman"/>
+          <w:i w:val="0"/>
+          <w:color w:val="000000"/>
+          <w:sz w:val="24"/>
+        </w:rPr>
+        <w:t xml:space="preserve">those of commit </w:t>
+      </w:r>
+      <w:r>
+        <w:rPr>
+          <w:rFonts w:ascii="Times New Roman" w:hAnsi="Times New Roman" w:eastAsia="Times New Roman"/>
+          <w:color w:val="000000"/>
+          <w:sz w:val="24"/>
+        </w:rPr>
+        <w:t>7da3eb8</w:t>
+      </w:r>
+      <w:r>
+        <w:rPr>
+          <w:rFonts w:ascii="Times New Roman" w:hAnsi="Times New Roman" w:eastAsia="Times New Roman"/>
+          <w:i w:val="0"/>
+          <w:color w:val="000000"/>
+          <w:sz w:val="24"/>
+        </w:rPr>
+        <w:t xml:space="preserve"> (7 October 2026). Validation dates were fixed before that run. Models refit every 20</w:t>
       </w:r>
     </w:p>
     <w:p>
+      <w:pPr>
+        <w:spacing w:after="160" w:line="276" w:lineRule="auto"/>
+      </w:pPr>
       <w:r>
-        <w:t>LLM explanations will not be represented as causal accounts of market movements. Information-poor or contradictory cases should produce an explicit limitation or abstention. Costs, latency and report stability across repeated runs will be recorded.</w:t>
+        <w:rPr>
+          <w:rFonts w:ascii="Times New Roman" w:hAnsi="Times New Roman" w:eastAsia="Times New Roman"/>
+          <w:i w:val="0"/>
+          <w:color w:val="000000"/>
+          <w:sz w:val="24"/>
+        </w:rPr>
+        <w:t xml:space="preserve">origins. A training label at horizon </w:t>
+      </w:r>
+      <w:r>
+        <w:rPr>
+          <w:rFonts w:ascii="Times New Roman" w:hAnsi="Times New Roman" w:eastAsia="Times New Roman"/>
+          <w:i/>
+          <w:color w:val="000000"/>
+          <w:sz w:val="24"/>
+        </w:rPr>
+        <w:t>h</w:t>
+      </w:r>
+      <w:r>
+        <w:rPr>
+          <w:rFonts w:ascii="Times New Roman" w:hAnsi="Times New Roman" w:eastAsia="Times New Roman"/>
+          <w:i w:val="0"/>
+          <w:color w:val="000000"/>
+          <w:sz w:val="24"/>
+        </w:rPr>
+        <w:t xml:space="preserve"> is used only if it was already observed. Features at</w:t>
       </w:r>
     </w:p>
     <w:p>
       <w:pPr>
-        <w:pStyle w:val="Heading1"/>
+        <w:spacing w:after="160" w:line="276" w:lineRule="auto"/>
       </w:pPr>
       <w:r>
-        <w:t>5 Experimental design</w:t>
+        <w:rPr>
+          <w:rFonts w:ascii="Times New Roman" w:hAnsi="Times New Roman" w:eastAsia="Times New Roman"/>
+          <w:i w:val="0"/>
+          <w:color w:val="000000"/>
+          <w:sz w:val="24"/>
+        </w:rPr>
+        <w:t>an origin do not change if later prices are replaced. Those properties are unit-tested.</w:t>
       </w:r>
     </w:p>
     <w:p>
       <w:pPr>
-        <w:pStyle w:val="Heading2"/>
+        <w:spacing w:after="160" w:line="276" w:lineRule="auto"/>
       </w:pPr>
       <w:r>
-        <w:t>5.1 Data and evaluation protocol</w:t>
+        <w:rPr>
+          <w:rFonts w:ascii="Times New Roman" w:hAnsi="Times New Roman" w:eastAsia="Times New Roman"/>
+          <w:i w:val="0"/>
+          <w:color w:val="000000"/>
+          <w:sz w:val="24"/>
+        </w:rPr>
+        <w:t>The test segment runs from 3 January 2023 into August 2026 (912 origins on VN30, 905 on BID).</w:t>
       </w:r>
     </w:p>
     <w:p>
+      <w:pPr>
+        <w:spacing w:after="160" w:line="276" w:lineRule="auto"/>
+      </w:pPr>
       <w:r>
-        <w:t>The financial study will use dated Bitcoin and VN30 snapshots with documented providers, calendars and usage rights. The demand study will use an accessible, licensed public retail-demand benchmark selected before experiments. A target inventory of roughly 50–100 demand series will balance diversity and compute. The exact series, exclusions, history lengths and horizons will be fixed in a protocol after inspecting data availability, before final model evaluation.</w:t>
+        <w:rPr>
+          <w:rFonts w:ascii="Times New Roman" w:hAnsi="Times New Roman" w:eastAsia="Times New Roman"/>
+          <w:i w:val="0"/>
+          <w:color w:val="000000"/>
+          <w:sz w:val="24"/>
+        </w:rPr>
+        <w:t>Horizons are 1, 5 and 20 sessions. The table is RMSE of the log-return forecast divided by</w:t>
       </w:r>
     </w:p>
     <w:p>
+      <w:pPr>
+        <w:spacing w:after="160" w:line="276" w:lineRule="auto"/>
+      </w:pPr>
       <w:r>
-        <w:t>Financial horizons will include 1, 5 and 20 observations; demand horizons will reflect the chosen dataset's frequency and decision cycle. Cryptocurrency days and equity trading sessions will not be treated as the same calendar. Price-level and return targets will be evaluated separately. Exogenous variables will enter only when observed or genuinely available as forecasts at the origin.</w:t>
+        <w:rPr>
+          <w:rFonts w:ascii="Times New Roman" w:hAnsi="Times New Roman" w:eastAsia="Times New Roman"/>
+          <w:i w:val="0"/>
+          <w:color w:val="000000"/>
+          <w:sz w:val="24"/>
+        </w:rPr>
+        <w:t>persistence. Below 1 would beat "no change".</w:t>
+      </w:r>
+    </w:p>
+    <w:tbl>
+      <w:tblPr>
+        <w:tblStyle w:val="TableGrid"/>
+        <w:tblW w:type="auto" w:w="0"/>
+        <w:tblLayout w:type="autofit"/>
+        <w:tblLook w:firstColumn="1" w:firstRow="1" w:lastColumn="0" w:lastRow="0" w:noHBand="0" w:noVBand="1" w:val="04A0"/>
+      </w:tblPr>
+      <w:tblGrid>
+        <w:gridCol w:w="1904"/>
+        <w:gridCol w:w="1904"/>
+        <w:gridCol w:w="1904"/>
+        <w:gridCol w:w="1904"/>
+        <w:gridCol w:w="1904"/>
+      </w:tblGrid>
+      <w:tr>
+        <w:tc>
+          <w:tcPr>
+            <w:tcW w:type="dxa" w:w="1904"/>
+            <w:shd w:val="clear" w:color="auto" w:fill="F2F2F2"/>
+          </w:tcPr>
+          <w:p>
+            <w:pPr>
+              <w:spacing w:after="0" w:before="0"/>
+            </w:pPr>
+            <w:r>
+              <w:rPr>
+                <w:b/>
+              </w:rPr>
+            </w:r>
+            <w:r>
+              <w:rPr>
+                <w:rFonts w:ascii="Times New Roman" w:hAnsi="Times New Roman" w:eastAsia="Times New Roman"/>
+                <w:b/>
+                <w:i w:val="0"/>
+                <w:color w:val="000000"/>
+                <w:sz w:val="20"/>
+              </w:rPr>
+              <w:t>Series</w:t>
+            </w:r>
+          </w:p>
+        </w:tc>
+        <w:tc>
+          <w:tcPr>
+            <w:tcW w:type="dxa" w:w="1904"/>
+            <w:shd w:val="clear" w:color="auto" w:fill="F2F2F2"/>
+          </w:tcPr>
+          <w:p>
+            <w:pPr>
+              <w:spacing w:after="0" w:before="0"/>
+            </w:pPr>
+            <w:r>
+              <w:rPr>
+                <w:b/>
+              </w:rPr>
+            </w:r>
+            <w:r>
+              <w:rPr>
+                <w:rFonts w:ascii="Times New Roman" w:hAnsi="Times New Roman" w:eastAsia="Times New Roman"/>
+                <w:b/>
+                <w:i w:val="0"/>
+                <w:color w:val="000000"/>
+                <w:sz w:val="20"/>
+              </w:rPr>
+              <w:t>Model</w:t>
+            </w:r>
+          </w:p>
+        </w:tc>
+        <w:tc>
+          <w:tcPr>
+            <w:tcW w:type="dxa" w:w="1904"/>
+            <w:shd w:val="clear" w:color="auto" w:fill="F2F2F2"/>
+          </w:tcPr>
+          <w:p>
+            <w:pPr>
+              <w:spacing w:after="0" w:before="0"/>
+            </w:pPr>
+            <w:r>
+              <w:rPr>
+                <w:b/>
+              </w:rPr>
+            </w:r>
+            <w:r>
+              <w:rPr>
+                <w:rFonts w:ascii="Times New Roman" w:hAnsi="Times New Roman" w:eastAsia="Times New Roman"/>
+                <w:b/>
+                <w:i w:val="0"/>
+                <w:color w:val="000000"/>
+                <w:sz w:val="20"/>
+              </w:rPr>
+              <w:t>h = 1</w:t>
+            </w:r>
+          </w:p>
+        </w:tc>
+        <w:tc>
+          <w:tcPr>
+            <w:tcW w:type="dxa" w:w="1904"/>
+            <w:shd w:val="clear" w:color="auto" w:fill="F2F2F2"/>
+          </w:tcPr>
+          <w:p>
+            <w:pPr>
+              <w:spacing w:after="0" w:before="0"/>
+            </w:pPr>
+            <w:r>
+              <w:rPr>
+                <w:b/>
+              </w:rPr>
+            </w:r>
+            <w:r>
+              <w:rPr>
+                <w:rFonts w:ascii="Times New Roman" w:hAnsi="Times New Roman" w:eastAsia="Times New Roman"/>
+                <w:b/>
+                <w:i w:val="0"/>
+                <w:color w:val="000000"/>
+                <w:sz w:val="20"/>
+              </w:rPr>
+              <w:t>h = 5</w:t>
+            </w:r>
+          </w:p>
+        </w:tc>
+        <w:tc>
+          <w:tcPr>
+            <w:tcW w:type="dxa" w:w="1904"/>
+            <w:shd w:val="clear" w:color="auto" w:fill="F2F2F2"/>
+          </w:tcPr>
+          <w:p>
+            <w:pPr>
+              <w:spacing w:after="0" w:before="0"/>
+            </w:pPr>
+            <w:r>
+              <w:rPr>
+                <w:b/>
+              </w:rPr>
+            </w:r>
+            <w:r>
+              <w:rPr>
+                <w:rFonts w:ascii="Times New Roman" w:hAnsi="Times New Roman" w:eastAsia="Times New Roman"/>
+                <w:b/>
+                <w:i w:val="0"/>
+                <w:color w:val="000000"/>
+                <w:sz w:val="20"/>
+              </w:rPr>
+              <w:t>h = 20</w:t>
+            </w:r>
+          </w:p>
+        </w:tc>
+      </w:tr>
+      <w:tr>
+        <w:tc>
+          <w:tcPr>
+            <w:tcW w:type="dxa" w:w="1904"/>
+          </w:tcPr>
+          <w:p>
+            <w:pPr>
+              <w:spacing w:after="0" w:before="0"/>
+            </w:pPr>
+            <w:r/>
+            <w:r>
+              <w:rPr>
+                <w:rFonts w:ascii="Times New Roman" w:hAnsi="Times New Roman" w:eastAsia="Times New Roman"/>
+                <w:i w:val="0"/>
+                <w:color w:val="000000"/>
+                <w:sz w:val="20"/>
+              </w:rPr>
+              <w:t>VN30</w:t>
+            </w:r>
+          </w:p>
+        </w:tc>
+        <w:tc>
+          <w:tcPr>
+            <w:tcW w:type="dxa" w:w="1904"/>
+          </w:tcPr>
+          <w:p>
+            <w:pPr>
+              <w:spacing w:after="0" w:before="0"/>
+            </w:pPr>
+            <w:r/>
+            <w:r>
+              <w:rPr>
+                <w:rFonts w:ascii="Times New Roman" w:hAnsi="Times New Roman" w:eastAsia="Times New Roman"/>
+                <w:i w:val="0"/>
+                <w:color w:val="000000"/>
+                <w:sz w:val="20"/>
+              </w:rPr>
+              <w:t>trailing drift</w:t>
+            </w:r>
+          </w:p>
+        </w:tc>
+        <w:tc>
+          <w:tcPr>
+            <w:tcW w:type="dxa" w:w="1904"/>
+          </w:tcPr>
+          <w:p>
+            <w:pPr>
+              <w:spacing w:after="0" w:before="0"/>
+            </w:pPr>
+            <w:r/>
+            <w:r>
+              <w:rPr>
+                <w:rFonts w:ascii="Times New Roman" w:hAnsi="Times New Roman" w:eastAsia="Times New Roman"/>
+                <w:i w:val="0"/>
+                <w:color w:val="000000"/>
+                <w:sz w:val="20"/>
+              </w:rPr>
+              <w:t>1.0023</w:t>
+            </w:r>
+          </w:p>
+        </w:tc>
+        <w:tc>
+          <w:tcPr>
+            <w:tcW w:type="dxa" w:w="1904"/>
+          </w:tcPr>
+          <w:p>
+            <w:pPr>
+              <w:spacing w:after="0" w:before="0"/>
+            </w:pPr>
+            <w:r/>
+            <w:r>
+              <w:rPr>
+                <w:rFonts w:ascii="Times New Roman" w:hAnsi="Times New Roman" w:eastAsia="Times New Roman"/>
+                <w:i w:val="0"/>
+                <w:color w:val="000000"/>
+                <w:sz w:val="20"/>
+              </w:rPr>
+              <w:t>1.0111</w:t>
+            </w:r>
+          </w:p>
+        </w:tc>
+        <w:tc>
+          <w:tcPr>
+            <w:tcW w:type="dxa" w:w="1904"/>
+          </w:tcPr>
+          <w:p>
+            <w:pPr>
+              <w:spacing w:after="0" w:before="0"/>
+            </w:pPr>
+            <w:r/>
+            <w:r>
+              <w:rPr>
+                <w:rFonts w:ascii="Times New Roman" w:hAnsi="Times New Roman" w:eastAsia="Times New Roman"/>
+                <w:i w:val="0"/>
+                <w:color w:val="000000"/>
+                <w:sz w:val="20"/>
+              </w:rPr>
+              <w:t>1.0415</w:t>
+            </w:r>
+          </w:p>
+        </w:tc>
+      </w:tr>
+      <w:tr>
+        <w:tc>
+          <w:tcPr>
+            <w:tcW w:type="dxa" w:w="1904"/>
+          </w:tcPr>
+          <w:p>
+            <w:pPr>
+              <w:spacing w:after="0" w:before="0"/>
+            </w:pPr>
+            <w:r/>
+            <w:r>
+              <w:rPr>
+                <w:rFonts w:ascii="Times New Roman" w:hAnsi="Times New Roman" w:eastAsia="Times New Roman"/>
+                <w:i w:val="0"/>
+                <w:color w:val="000000"/>
+                <w:sz w:val="20"/>
+              </w:rPr>
+              <w:t>VN30</w:t>
+            </w:r>
+          </w:p>
+        </w:tc>
+        <w:tc>
+          <w:tcPr>
+            <w:tcW w:type="dxa" w:w="1904"/>
+          </w:tcPr>
+          <w:p>
+            <w:pPr>
+              <w:spacing w:after="0" w:before="0"/>
+            </w:pPr>
+            <w:r/>
+            <w:r>
+              <w:rPr>
+                <w:rFonts w:ascii="Times New Roman" w:hAnsi="Times New Roman" w:eastAsia="Times New Roman"/>
+                <w:i w:val="0"/>
+                <w:color w:val="000000"/>
+                <w:sz w:val="20"/>
+              </w:rPr>
+              <w:t>ridge</w:t>
+            </w:r>
+          </w:p>
+        </w:tc>
+        <w:tc>
+          <w:tcPr>
+            <w:tcW w:type="dxa" w:w="1904"/>
+          </w:tcPr>
+          <w:p>
+            <w:pPr>
+              <w:spacing w:after="0" w:before="0"/>
+            </w:pPr>
+            <w:r/>
+            <w:r>
+              <w:rPr>
+                <w:rFonts w:ascii="Times New Roman" w:hAnsi="Times New Roman" w:eastAsia="Times New Roman"/>
+                <w:i w:val="0"/>
+                <w:color w:val="000000"/>
+                <w:sz w:val="20"/>
+              </w:rPr>
+              <w:t>0.9976</w:t>
+            </w:r>
+          </w:p>
+        </w:tc>
+        <w:tc>
+          <w:tcPr>
+            <w:tcW w:type="dxa" w:w="1904"/>
+          </w:tcPr>
+          <w:p>
+            <w:pPr>
+              <w:spacing w:after="0" w:before="0"/>
+            </w:pPr>
+            <w:r/>
+            <w:r>
+              <w:rPr>
+                <w:rFonts w:ascii="Times New Roman" w:hAnsi="Times New Roman" w:eastAsia="Times New Roman"/>
+                <w:i w:val="0"/>
+                <w:color w:val="000000"/>
+                <w:sz w:val="20"/>
+              </w:rPr>
+              <w:t>0.9969</w:t>
+            </w:r>
+          </w:p>
+        </w:tc>
+        <w:tc>
+          <w:tcPr>
+            <w:tcW w:type="dxa" w:w="1904"/>
+          </w:tcPr>
+          <w:p>
+            <w:pPr>
+              <w:spacing w:after="0" w:before="0"/>
+            </w:pPr>
+            <w:r/>
+            <w:r>
+              <w:rPr>
+                <w:rFonts w:ascii="Times New Roman" w:hAnsi="Times New Roman" w:eastAsia="Times New Roman"/>
+                <w:i w:val="0"/>
+                <w:color w:val="000000"/>
+                <w:sz w:val="20"/>
+              </w:rPr>
+              <w:t>0.9718</w:t>
+            </w:r>
+          </w:p>
+        </w:tc>
+      </w:tr>
+      <w:tr>
+        <w:tc>
+          <w:tcPr>
+            <w:tcW w:type="dxa" w:w="1904"/>
+          </w:tcPr>
+          <w:p>
+            <w:pPr>
+              <w:spacing w:after="0" w:before="0"/>
+            </w:pPr>
+            <w:r/>
+            <w:r>
+              <w:rPr>
+                <w:rFonts w:ascii="Times New Roman" w:hAnsi="Times New Roman" w:eastAsia="Times New Roman"/>
+                <w:i w:val="0"/>
+                <w:color w:val="000000"/>
+                <w:sz w:val="20"/>
+              </w:rPr>
+              <w:t>VN30</w:t>
+            </w:r>
+          </w:p>
+        </w:tc>
+        <w:tc>
+          <w:tcPr>
+            <w:tcW w:type="dxa" w:w="1904"/>
+          </w:tcPr>
+          <w:p>
+            <w:pPr>
+              <w:spacing w:after="0" w:before="0"/>
+            </w:pPr>
+            <w:r/>
+            <w:r>
+              <w:rPr>
+                <w:rFonts w:ascii="Times New Roman" w:hAnsi="Times New Roman" w:eastAsia="Times New Roman"/>
+                <w:i w:val="0"/>
+                <w:color w:val="000000"/>
+                <w:sz w:val="20"/>
+              </w:rPr>
+              <w:t>extra-trees</w:t>
+            </w:r>
+          </w:p>
+        </w:tc>
+        <w:tc>
+          <w:tcPr>
+            <w:tcW w:type="dxa" w:w="1904"/>
+          </w:tcPr>
+          <w:p>
+            <w:pPr>
+              <w:spacing w:after="0" w:before="0"/>
+            </w:pPr>
+            <w:r/>
+            <w:r>
+              <w:rPr>
+                <w:rFonts w:ascii="Times New Roman" w:hAnsi="Times New Roman" w:eastAsia="Times New Roman"/>
+                <w:i w:val="0"/>
+                <w:color w:val="000000"/>
+                <w:sz w:val="20"/>
+              </w:rPr>
+              <w:t>0.9974</w:t>
+            </w:r>
+          </w:p>
+        </w:tc>
+        <w:tc>
+          <w:tcPr>
+            <w:tcW w:type="dxa" w:w="1904"/>
+          </w:tcPr>
+          <w:p>
+            <w:pPr>
+              <w:spacing w:after="0" w:before="0"/>
+            </w:pPr>
+            <w:r/>
+            <w:r>
+              <w:rPr>
+                <w:rFonts w:ascii="Times New Roman" w:hAnsi="Times New Roman" w:eastAsia="Times New Roman"/>
+                <w:i w:val="0"/>
+                <w:color w:val="000000"/>
+                <w:sz w:val="20"/>
+              </w:rPr>
+              <w:t>0.9989</w:t>
+            </w:r>
+          </w:p>
+        </w:tc>
+        <w:tc>
+          <w:tcPr>
+            <w:tcW w:type="dxa" w:w="1904"/>
+          </w:tcPr>
+          <w:p>
+            <w:pPr>
+              <w:spacing w:after="0" w:before="0"/>
+            </w:pPr>
+            <w:r/>
+            <w:r>
+              <w:rPr>
+                <w:rFonts w:ascii="Times New Roman" w:hAnsi="Times New Roman" w:eastAsia="Times New Roman"/>
+                <w:i w:val="0"/>
+                <w:color w:val="000000"/>
+                <w:sz w:val="20"/>
+              </w:rPr>
+              <w:t>0.9736</w:t>
+            </w:r>
+          </w:p>
+        </w:tc>
+      </w:tr>
+      <w:tr>
+        <w:tc>
+          <w:tcPr>
+            <w:tcW w:type="dxa" w:w="1904"/>
+          </w:tcPr>
+          <w:p>
+            <w:pPr>
+              <w:spacing w:after="0" w:before="0"/>
+            </w:pPr>
+            <w:r/>
+            <w:r>
+              <w:rPr>
+                <w:rFonts w:ascii="Times New Roman" w:hAnsi="Times New Roman" w:eastAsia="Times New Roman"/>
+                <w:i w:val="0"/>
+                <w:color w:val="000000"/>
+                <w:sz w:val="20"/>
+              </w:rPr>
+              <w:t>VN30</w:t>
+            </w:r>
+          </w:p>
+        </w:tc>
+        <w:tc>
+          <w:tcPr>
+            <w:tcW w:type="dxa" w:w="1904"/>
+          </w:tcPr>
+          <w:p>
+            <w:pPr>
+              <w:spacing w:after="0" w:before="0"/>
+            </w:pPr>
+            <w:r/>
+            <w:r>
+              <w:rPr>
+                <w:rFonts w:ascii="Times New Roman" w:hAnsi="Times New Roman" w:eastAsia="Times New Roman"/>
+                <w:i w:val="0"/>
+                <w:color w:val="000000"/>
+                <w:sz w:val="20"/>
+              </w:rPr>
+              <w:t>gradient boosting</w:t>
+            </w:r>
+          </w:p>
+        </w:tc>
+        <w:tc>
+          <w:tcPr>
+            <w:tcW w:type="dxa" w:w="1904"/>
+          </w:tcPr>
+          <w:p>
+            <w:pPr>
+              <w:spacing w:after="0" w:before="0"/>
+            </w:pPr>
+            <w:r/>
+            <w:r>
+              <w:rPr>
+                <w:rFonts w:ascii="Times New Roman" w:hAnsi="Times New Roman" w:eastAsia="Times New Roman"/>
+                <w:i w:val="0"/>
+                <w:color w:val="000000"/>
+                <w:sz w:val="20"/>
+              </w:rPr>
+              <w:t>0.9963</w:t>
+            </w:r>
+          </w:p>
+        </w:tc>
+        <w:tc>
+          <w:tcPr>
+            <w:tcW w:type="dxa" w:w="1904"/>
+          </w:tcPr>
+          <w:p>
+            <w:pPr>
+              <w:spacing w:after="0" w:before="0"/>
+            </w:pPr>
+            <w:r/>
+            <w:r>
+              <w:rPr>
+                <w:rFonts w:ascii="Times New Roman" w:hAnsi="Times New Roman" w:eastAsia="Times New Roman"/>
+                <w:i w:val="0"/>
+                <w:color w:val="000000"/>
+                <w:sz w:val="20"/>
+              </w:rPr>
+              <w:t>0.9965</w:t>
+            </w:r>
+          </w:p>
+        </w:tc>
+        <w:tc>
+          <w:tcPr>
+            <w:tcW w:type="dxa" w:w="1904"/>
+          </w:tcPr>
+          <w:p>
+            <w:pPr>
+              <w:spacing w:after="0" w:before="0"/>
+            </w:pPr>
+            <w:r/>
+            <w:r>
+              <w:rPr>
+                <w:rFonts w:ascii="Times New Roman" w:hAnsi="Times New Roman" w:eastAsia="Times New Roman"/>
+                <w:i w:val="0"/>
+                <w:color w:val="000000"/>
+                <w:sz w:val="20"/>
+              </w:rPr>
+              <w:t>1.0040</w:t>
+            </w:r>
+          </w:p>
+        </w:tc>
+      </w:tr>
+      <w:tr>
+        <w:tc>
+          <w:tcPr>
+            <w:tcW w:type="dxa" w:w="1904"/>
+          </w:tcPr>
+          <w:p>
+            <w:pPr>
+              <w:spacing w:after="0" w:before="0"/>
+            </w:pPr>
+            <w:r/>
+            <w:r>
+              <w:rPr>
+                <w:rFonts w:ascii="Times New Roman" w:hAnsi="Times New Roman" w:eastAsia="Times New Roman"/>
+                <w:i w:val="0"/>
+                <w:color w:val="000000"/>
+                <w:sz w:val="20"/>
+              </w:rPr>
+              <w:t>BID</w:t>
+            </w:r>
+          </w:p>
+        </w:tc>
+        <w:tc>
+          <w:tcPr>
+            <w:tcW w:type="dxa" w:w="1904"/>
+          </w:tcPr>
+          <w:p>
+            <w:pPr>
+              <w:spacing w:after="0" w:before="0"/>
+            </w:pPr>
+            <w:r/>
+            <w:r>
+              <w:rPr>
+                <w:rFonts w:ascii="Times New Roman" w:hAnsi="Times New Roman" w:eastAsia="Times New Roman"/>
+                <w:i w:val="0"/>
+                <w:color w:val="000000"/>
+                <w:sz w:val="20"/>
+              </w:rPr>
+              <w:t>trailing drift</w:t>
+            </w:r>
+          </w:p>
+        </w:tc>
+        <w:tc>
+          <w:tcPr>
+            <w:tcW w:type="dxa" w:w="1904"/>
+          </w:tcPr>
+          <w:p>
+            <w:pPr>
+              <w:spacing w:after="0" w:before="0"/>
+            </w:pPr>
+            <w:r/>
+            <w:r>
+              <w:rPr>
+                <w:rFonts w:ascii="Times New Roman" w:hAnsi="Times New Roman" w:eastAsia="Times New Roman"/>
+                <w:i w:val="0"/>
+                <w:color w:val="000000"/>
+                <w:sz w:val="20"/>
+              </w:rPr>
+              <w:t>1.0019</w:t>
+            </w:r>
+          </w:p>
+        </w:tc>
+        <w:tc>
+          <w:tcPr>
+            <w:tcW w:type="dxa" w:w="1904"/>
+          </w:tcPr>
+          <w:p>
+            <w:pPr>
+              <w:spacing w:after="0" w:before="0"/>
+            </w:pPr>
+            <w:r/>
+            <w:r>
+              <w:rPr>
+                <w:rFonts w:ascii="Times New Roman" w:hAnsi="Times New Roman" w:eastAsia="Times New Roman"/>
+                <w:i w:val="0"/>
+                <w:color w:val="000000"/>
+                <w:sz w:val="20"/>
+              </w:rPr>
+              <w:t>1.0084</w:t>
+            </w:r>
+          </w:p>
+        </w:tc>
+        <w:tc>
+          <w:tcPr>
+            <w:tcW w:type="dxa" w:w="1904"/>
+          </w:tcPr>
+          <w:p>
+            <w:pPr>
+              <w:spacing w:after="0" w:before="0"/>
+            </w:pPr>
+            <w:r/>
+            <w:r>
+              <w:rPr>
+                <w:rFonts w:ascii="Times New Roman" w:hAnsi="Times New Roman" w:eastAsia="Times New Roman"/>
+                <w:i w:val="0"/>
+                <w:color w:val="000000"/>
+                <w:sz w:val="20"/>
+              </w:rPr>
+              <w:t>1.0310</w:t>
+            </w:r>
+          </w:p>
+        </w:tc>
+      </w:tr>
+      <w:tr>
+        <w:tc>
+          <w:tcPr>
+            <w:tcW w:type="dxa" w:w="1904"/>
+          </w:tcPr>
+          <w:p>
+            <w:pPr>
+              <w:spacing w:after="0" w:before="0"/>
+            </w:pPr>
+            <w:r/>
+            <w:r>
+              <w:rPr>
+                <w:rFonts w:ascii="Times New Roman" w:hAnsi="Times New Roman" w:eastAsia="Times New Roman"/>
+                <w:i w:val="0"/>
+                <w:color w:val="000000"/>
+                <w:sz w:val="20"/>
+              </w:rPr>
+              <w:t>BID</w:t>
+            </w:r>
+          </w:p>
+        </w:tc>
+        <w:tc>
+          <w:tcPr>
+            <w:tcW w:type="dxa" w:w="1904"/>
+          </w:tcPr>
+          <w:p>
+            <w:pPr>
+              <w:spacing w:after="0" w:before="0"/>
+            </w:pPr>
+            <w:r/>
+            <w:r>
+              <w:rPr>
+                <w:rFonts w:ascii="Times New Roman" w:hAnsi="Times New Roman" w:eastAsia="Times New Roman"/>
+                <w:i w:val="0"/>
+                <w:color w:val="000000"/>
+                <w:sz w:val="20"/>
+              </w:rPr>
+              <w:t>ridge</w:t>
+            </w:r>
+          </w:p>
+        </w:tc>
+        <w:tc>
+          <w:tcPr>
+            <w:tcW w:type="dxa" w:w="1904"/>
+          </w:tcPr>
+          <w:p>
+            <w:pPr>
+              <w:spacing w:after="0" w:before="0"/>
+            </w:pPr>
+            <w:r/>
+            <w:r>
+              <w:rPr>
+                <w:rFonts w:ascii="Times New Roman" w:hAnsi="Times New Roman" w:eastAsia="Times New Roman"/>
+                <w:i w:val="0"/>
+                <w:color w:val="000000"/>
+                <w:sz w:val="20"/>
+              </w:rPr>
+              <w:t>0.9973</w:t>
+            </w:r>
+          </w:p>
+        </w:tc>
+        <w:tc>
+          <w:tcPr>
+            <w:tcW w:type="dxa" w:w="1904"/>
+          </w:tcPr>
+          <w:p>
+            <w:pPr>
+              <w:spacing w:after="0" w:before="0"/>
+            </w:pPr>
+            <w:r/>
+            <w:r>
+              <w:rPr>
+                <w:rFonts w:ascii="Times New Roman" w:hAnsi="Times New Roman" w:eastAsia="Times New Roman"/>
+                <w:i w:val="0"/>
+                <w:color w:val="000000"/>
+                <w:sz w:val="20"/>
+              </w:rPr>
+              <w:t>0.9897</w:t>
+            </w:r>
+          </w:p>
+        </w:tc>
+        <w:tc>
+          <w:tcPr>
+            <w:tcW w:type="dxa" w:w="1904"/>
+          </w:tcPr>
+          <w:p>
+            <w:pPr>
+              <w:spacing w:after="0" w:before="0"/>
+            </w:pPr>
+            <w:r/>
+            <w:r>
+              <w:rPr>
+                <w:rFonts w:ascii="Times New Roman" w:hAnsi="Times New Roman" w:eastAsia="Times New Roman"/>
+                <w:i w:val="0"/>
+                <w:color w:val="000000"/>
+                <w:sz w:val="20"/>
+              </w:rPr>
+              <w:t>0.9768</w:t>
+            </w:r>
+          </w:p>
+        </w:tc>
+      </w:tr>
+      <w:tr>
+        <w:tc>
+          <w:tcPr>
+            <w:tcW w:type="dxa" w:w="1904"/>
+          </w:tcPr>
+          <w:p>
+            <w:pPr>
+              <w:spacing w:after="0" w:before="0"/>
+            </w:pPr>
+            <w:r/>
+            <w:r>
+              <w:rPr>
+                <w:rFonts w:ascii="Times New Roman" w:hAnsi="Times New Roman" w:eastAsia="Times New Roman"/>
+                <w:i w:val="0"/>
+                <w:color w:val="000000"/>
+                <w:sz w:val="20"/>
+              </w:rPr>
+              <w:t>BID</w:t>
+            </w:r>
+          </w:p>
+        </w:tc>
+        <w:tc>
+          <w:tcPr>
+            <w:tcW w:type="dxa" w:w="1904"/>
+          </w:tcPr>
+          <w:p>
+            <w:pPr>
+              <w:spacing w:after="0" w:before="0"/>
+            </w:pPr>
+            <w:r/>
+            <w:r>
+              <w:rPr>
+                <w:rFonts w:ascii="Times New Roman" w:hAnsi="Times New Roman" w:eastAsia="Times New Roman"/>
+                <w:i w:val="0"/>
+                <w:color w:val="000000"/>
+                <w:sz w:val="20"/>
+              </w:rPr>
+              <w:t>extra-trees</w:t>
+            </w:r>
+          </w:p>
+        </w:tc>
+        <w:tc>
+          <w:tcPr>
+            <w:tcW w:type="dxa" w:w="1904"/>
+          </w:tcPr>
+          <w:p>
+            <w:pPr>
+              <w:spacing w:after="0" w:before="0"/>
+            </w:pPr>
+            <w:r/>
+            <w:r>
+              <w:rPr>
+                <w:rFonts w:ascii="Times New Roman" w:hAnsi="Times New Roman" w:eastAsia="Times New Roman"/>
+                <w:i w:val="0"/>
+                <w:color w:val="000000"/>
+                <w:sz w:val="20"/>
+              </w:rPr>
+              <w:t>0.9982</w:t>
+            </w:r>
+          </w:p>
+        </w:tc>
+        <w:tc>
+          <w:tcPr>
+            <w:tcW w:type="dxa" w:w="1904"/>
+          </w:tcPr>
+          <w:p>
+            <w:pPr>
+              <w:spacing w:after="0" w:before="0"/>
+            </w:pPr>
+            <w:r/>
+            <w:r>
+              <w:rPr>
+                <w:rFonts w:ascii="Times New Roman" w:hAnsi="Times New Roman" w:eastAsia="Times New Roman"/>
+                <w:i w:val="0"/>
+                <w:color w:val="000000"/>
+                <w:sz w:val="20"/>
+              </w:rPr>
+              <w:t>1.0011</w:t>
+            </w:r>
+          </w:p>
+        </w:tc>
+        <w:tc>
+          <w:tcPr>
+            <w:tcW w:type="dxa" w:w="1904"/>
+          </w:tcPr>
+          <w:p>
+            <w:pPr>
+              <w:spacing w:after="0" w:before="0"/>
+            </w:pPr>
+            <w:r/>
+            <w:r>
+              <w:rPr>
+                <w:rFonts w:ascii="Times New Roman" w:hAnsi="Times New Roman" w:eastAsia="Times New Roman"/>
+                <w:i w:val="0"/>
+                <w:color w:val="000000"/>
+                <w:sz w:val="20"/>
+              </w:rPr>
+              <w:t>1.0065</w:t>
+            </w:r>
+          </w:p>
+        </w:tc>
+      </w:tr>
+      <w:tr>
+        <w:tc>
+          <w:tcPr>
+            <w:tcW w:type="dxa" w:w="1904"/>
+          </w:tcPr>
+          <w:p>
+            <w:pPr>
+              <w:spacing w:after="0" w:before="0"/>
+            </w:pPr>
+            <w:r/>
+            <w:r>
+              <w:rPr>
+                <w:rFonts w:ascii="Times New Roman" w:hAnsi="Times New Roman" w:eastAsia="Times New Roman"/>
+                <w:i w:val="0"/>
+                <w:color w:val="000000"/>
+                <w:sz w:val="20"/>
+              </w:rPr>
+              <w:t>BID</w:t>
+            </w:r>
+          </w:p>
+        </w:tc>
+        <w:tc>
+          <w:tcPr>
+            <w:tcW w:type="dxa" w:w="1904"/>
+          </w:tcPr>
+          <w:p>
+            <w:pPr>
+              <w:spacing w:after="0" w:before="0"/>
+            </w:pPr>
+            <w:r/>
+            <w:r>
+              <w:rPr>
+                <w:rFonts w:ascii="Times New Roman" w:hAnsi="Times New Roman" w:eastAsia="Times New Roman"/>
+                <w:i w:val="0"/>
+                <w:color w:val="000000"/>
+                <w:sz w:val="20"/>
+              </w:rPr>
+              <w:t>gradient boosting</w:t>
+            </w:r>
+          </w:p>
+        </w:tc>
+        <w:tc>
+          <w:tcPr>
+            <w:tcW w:type="dxa" w:w="1904"/>
+          </w:tcPr>
+          <w:p>
+            <w:pPr>
+              <w:spacing w:after="0" w:before="0"/>
+            </w:pPr>
+            <w:r/>
+            <w:r>
+              <w:rPr>
+                <w:rFonts w:ascii="Times New Roman" w:hAnsi="Times New Roman" w:eastAsia="Times New Roman"/>
+                <w:i w:val="0"/>
+                <w:color w:val="000000"/>
+                <w:sz w:val="20"/>
+              </w:rPr>
+              <w:t>0.9961</w:t>
+            </w:r>
+          </w:p>
+        </w:tc>
+        <w:tc>
+          <w:tcPr>
+            <w:tcW w:type="dxa" w:w="1904"/>
+          </w:tcPr>
+          <w:p>
+            <w:pPr>
+              <w:spacing w:after="0" w:before="0"/>
+            </w:pPr>
+            <w:r/>
+            <w:r>
+              <w:rPr>
+                <w:rFonts w:ascii="Times New Roman" w:hAnsi="Times New Roman" w:eastAsia="Times New Roman"/>
+                <w:i w:val="0"/>
+                <w:color w:val="000000"/>
+                <w:sz w:val="20"/>
+              </w:rPr>
+              <w:t>1.0033</w:t>
+            </w:r>
+          </w:p>
+        </w:tc>
+        <w:tc>
+          <w:tcPr>
+            <w:tcW w:type="dxa" w:w="1904"/>
+          </w:tcPr>
+          <w:p>
+            <w:pPr>
+              <w:spacing w:after="0" w:before="0"/>
+            </w:pPr>
+            <w:r/>
+            <w:r>
+              <w:rPr>
+                <w:rFonts w:ascii="Times New Roman" w:hAnsi="Times New Roman" w:eastAsia="Times New Roman"/>
+                <w:i w:val="0"/>
+                <w:color w:val="000000"/>
+                <w:sz w:val="20"/>
+              </w:rPr>
+              <w:t>1.0155</w:t>
+            </w:r>
+          </w:p>
+        </w:tc>
+      </w:tr>
+    </w:tbl>
+    <w:p/>
+    <w:p>
+      <w:pPr>
+        <w:spacing w:after="160" w:line="276" w:lineRule="auto"/>
+      </w:pPr>
+      <w:r>
+        <w:rPr>
+          <w:rFonts w:ascii="Times New Roman" w:hAnsi="Times New Roman" w:eastAsia="Times New Roman"/>
+          <w:i w:val="0"/>
+          <w:color w:val="000000"/>
+          <w:sz w:val="24"/>
+        </w:rPr>
+        <w:t>No comparison with persistence is significant after a Diebold–Mariano test with HAC variance,</w:t>
       </w:r>
     </w:p>
     <w:p>
+      <w:pPr>
+        <w:spacing w:after="160" w:line="276" w:lineRule="auto"/>
+      </w:pPr>
       <w:r>
-        <w:t>Chronological partitions will separate training, model selection, calibration and a final untouched evaluation period. Rolling-origin evaluation will retain predictions at every origin and horizon. Feature engineering, scaling, missing-value treatment and hyperparameter selection will be fitted within the applicable training partition. Overlapping target windows will be handled with an appropriate gap at split boundaries. Fixed-origin multi-step forecasts and rolling one-step forecasts will be labelled and assessed separately. Once final evaluation begins, subsequent changes will require a new prospective evaluation period.</w:t>
+        <w:rPr>
+          <w:rFonts w:ascii="Times New Roman" w:hAnsi="Times New Roman" w:eastAsia="Times New Roman"/>
+          <w:i w:val="0"/>
+          <w:color w:val="000000"/>
+          <w:sz w:val="24"/>
+        </w:rPr>
+        <w:t xml:space="preserve">a block bootstrap, and Holm correction (adjusted </w:t>
+      </w:r>
+      <w:r>
+        <w:rPr>
+          <w:rFonts w:ascii="Times New Roman" w:hAnsi="Times New Roman" w:eastAsia="Times New Roman"/>
+          <w:i/>
+          <w:color w:val="000000"/>
+          <w:sz w:val="24"/>
+        </w:rPr>
+        <w:t>p</w:t>
+      </w:r>
+      <w:r>
+        <w:rPr>
+          <w:rFonts w:ascii="Times New Roman" w:hAnsi="Times New Roman" w:eastAsia="Times New Roman"/>
+          <w:i w:val="0"/>
+          <w:color w:val="000000"/>
+          <w:sz w:val="24"/>
+        </w:rPr>
+        <w:t xml:space="preserve"> = 1 in all 24 tests). A ridge ratio near</w:t>
       </w:r>
     </w:p>
     <w:p>
       <w:pPr>
-        <w:pStyle w:val="Heading2"/>
+        <w:spacing w:after="160" w:line="276" w:lineRule="auto"/>
       </w:pPr>
       <w:r>
-        <w:t>5.2 Metrics and comparisons</w:t>
+        <w:rPr>
+          <w:rFonts w:ascii="Times New Roman" w:hAnsi="Times New Roman" w:eastAsia="Times New Roman"/>
+          <w:i w:val="0"/>
+          <w:color w:val="000000"/>
+          <w:sz w:val="24"/>
+        </w:rPr>
+        <w:t>0.97 at horizon 20 appears on both series. With overlapping errors and one test window, that</w:t>
       </w:r>
     </w:p>
     <w:p>
+      <w:pPr>
+        <w:spacing w:after="160" w:line="276" w:lineRule="auto"/>
+      </w:pPr>
       <w:r>
-        <w:t>Point forecasts will be assessed using MAE, RMSE and MASE with the scaling denominator fitted on training data. MAPE will be secondary and used only where its denominator is meaningful; it will not be used for returns or near-zero demand. Quantile forecasts will use pinball loss. Interval evaluation will report empirical coverage at 80% and 95%, mean width and an interval score. Results will be broken down by horizon and predefined seasonality, volatility and drift characteristics.</w:t>
+        <w:rPr>
+          <w:rFonts w:ascii="Times New Roman" w:hAnsi="Times New Roman" w:eastAsia="Times New Roman"/>
+          <w:i w:val="0"/>
+          <w:color w:val="000000"/>
+          <w:sz w:val="24"/>
+        </w:rPr>
+        <w:t>is a lead for more data, not a result.</w:t>
       </w:r>
     </w:p>
     <w:p>
+      <w:pPr>
+        <w:spacing w:after="160" w:line="276" w:lineRule="auto"/>
+      </w:pPr>
       <w:r>
-        <w:t>Temporal block resampling will estimate uncertainty in performance differences, recognising dependence and overlapping horizons. Aggregate results will include the distribution across series, failed fits and runtime rather than only the best result. Seed variability, compute budgets and calibration-update timing will be recorded.</w:t>
+        <w:rPr>
+          <w:rFonts w:ascii="Times New Roman" w:hAnsi="Times New Roman" w:eastAsia="Times New Roman"/>
+          <w:i w:val="0"/>
+          <w:color w:val="000000"/>
+          <w:sz w:val="24"/>
+        </w:rPr>
+        <w:t>Empirical coverage at horizon 5:</w:t>
+      </w:r>
+    </w:p>
+    <w:tbl>
+      <w:tblPr>
+        <w:tblStyle w:val="TableGrid"/>
+        <w:tblW w:type="auto" w:w="0"/>
+        <w:tblLayout w:type="autofit"/>
+        <w:tblLook w:firstColumn="1" w:firstRow="1" w:lastColumn="0" w:lastRow="0" w:noHBand="0" w:noVBand="1" w:val="04A0"/>
+      </w:tblPr>
+      <w:tblGrid>
+        <w:gridCol w:w="1904"/>
+        <w:gridCol w:w="1904"/>
+        <w:gridCol w:w="1904"/>
+        <w:gridCol w:w="1904"/>
+        <w:gridCol w:w="1904"/>
+      </w:tblGrid>
+      <w:tr>
+        <w:tc>
+          <w:tcPr>
+            <w:tcW w:type="dxa" w:w="1904"/>
+            <w:shd w:val="clear" w:color="auto" w:fill="F2F2F2"/>
+          </w:tcPr>
+          <w:p>
+            <w:pPr>
+              <w:spacing w:after="0" w:before="0"/>
+            </w:pPr>
+            <w:r>
+              <w:rPr>
+                <w:b/>
+              </w:rPr>
+            </w:r>
+            <w:r>
+              <w:rPr>
+                <w:rFonts w:ascii="Times New Roman" w:hAnsi="Times New Roman" w:eastAsia="Times New Roman"/>
+                <w:b/>
+                <w:i w:val="0"/>
+                <w:color w:val="000000"/>
+                <w:sz w:val="20"/>
+              </w:rPr>
+              <w:t>Method</w:t>
+            </w:r>
+          </w:p>
+        </w:tc>
+        <w:tc>
+          <w:tcPr>
+            <w:tcW w:type="dxa" w:w="1904"/>
+            <w:shd w:val="clear" w:color="auto" w:fill="F2F2F2"/>
+          </w:tcPr>
+          <w:p>
+            <w:pPr>
+              <w:spacing w:after="0" w:before="0"/>
+            </w:pPr>
+            <w:r>
+              <w:rPr>
+                <w:b/>
+              </w:rPr>
+            </w:r>
+            <w:r>
+              <w:rPr>
+                <w:rFonts w:ascii="Times New Roman" w:hAnsi="Times New Roman" w:eastAsia="Times New Roman"/>
+                <w:b/>
+                <w:i w:val="0"/>
+                <w:color w:val="000000"/>
+                <w:sz w:val="20"/>
+              </w:rPr>
+              <w:t>VN30 80%</w:t>
+            </w:r>
+          </w:p>
+        </w:tc>
+        <w:tc>
+          <w:tcPr>
+            <w:tcW w:type="dxa" w:w="1904"/>
+            <w:shd w:val="clear" w:color="auto" w:fill="F2F2F2"/>
+          </w:tcPr>
+          <w:p>
+            <w:pPr>
+              <w:spacing w:after="0" w:before="0"/>
+            </w:pPr>
+            <w:r>
+              <w:rPr>
+                <w:b/>
+              </w:rPr>
+            </w:r>
+            <w:r>
+              <w:rPr>
+                <w:rFonts w:ascii="Times New Roman" w:hAnsi="Times New Roman" w:eastAsia="Times New Roman"/>
+                <w:b/>
+                <w:i w:val="0"/>
+                <w:color w:val="000000"/>
+                <w:sz w:val="20"/>
+              </w:rPr>
+              <w:t>VN30 95%</w:t>
+            </w:r>
+          </w:p>
+        </w:tc>
+        <w:tc>
+          <w:tcPr>
+            <w:tcW w:type="dxa" w:w="1904"/>
+            <w:shd w:val="clear" w:color="auto" w:fill="F2F2F2"/>
+          </w:tcPr>
+          <w:p>
+            <w:pPr>
+              <w:spacing w:after="0" w:before="0"/>
+            </w:pPr>
+            <w:r>
+              <w:rPr>
+                <w:b/>
+              </w:rPr>
+            </w:r>
+            <w:r>
+              <w:rPr>
+                <w:rFonts w:ascii="Times New Roman" w:hAnsi="Times New Roman" w:eastAsia="Times New Roman"/>
+                <w:b/>
+                <w:i w:val="0"/>
+                <w:color w:val="000000"/>
+                <w:sz w:val="20"/>
+              </w:rPr>
+              <w:t>BID 80%</w:t>
+            </w:r>
+          </w:p>
+        </w:tc>
+        <w:tc>
+          <w:tcPr>
+            <w:tcW w:type="dxa" w:w="1904"/>
+            <w:shd w:val="clear" w:color="auto" w:fill="F2F2F2"/>
+          </w:tcPr>
+          <w:p>
+            <w:pPr>
+              <w:spacing w:after="0" w:before="0"/>
+            </w:pPr>
+            <w:r>
+              <w:rPr>
+                <w:b/>
+              </w:rPr>
+            </w:r>
+            <w:r>
+              <w:rPr>
+                <w:rFonts w:ascii="Times New Roman" w:hAnsi="Times New Roman" w:eastAsia="Times New Roman"/>
+                <w:b/>
+                <w:i w:val="0"/>
+                <w:color w:val="000000"/>
+                <w:sz w:val="20"/>
+              </w:rPr>
+              <w:t>BID 95%</w:t>
+            </w:r>
+          </w:p>
+        </w:tc>
+      </w:tr>
+      <w:tr>
+        <w:tc>
+          <w:tcPr>
+            <w:tcW w:type="dxa" w:w="1904"/>
+          </w:tcPr>
+          <w:p>
+            <w:pPr>
+              <w:spacing w:after="0" w:before="0"/>
+            </w:pPr>
+            <w:r/>
+            <w:r>
+              <w:rPr>
+                <w:rFonts w:ascii="Times New Roman" w:hAnsi="Times New Roman" w:eastAsia="Times New Roman"/>
+                <w:i w:val="0"/>
+                <w:color w:val="000000"/>
+                <w:sz w:val="20"/>
+              </w:rPr>
+              <w:t>Gaussian, EWMA volatility</w:t>
+            </w:r>
+          </w:p>
+        </w:tc>
+        <w:tc>
+          <w:tcPr>
+            <w:tcW w:type="dxa" w:w="1904"/>
+          </w:tcPr>
+          <w:p>
+            <w:pPr>
+              <w:spacing w:after="0" w:before="0"/>
+            </w:pPr>
+            <w:r/>
+            <w:r>
+              <w:rPr>
+                <w:rFonts w:ascii="Times New Roman" w:hAnsi="Times New Roman" w:eastAsia="Times New Roman"/>
+                <w:i w:val="0"/>
+                <w:color w:val="000000"/>
+                <w:sz w:val="20"/>
+              </w:rPr>
+              <w:t>0.802</w:t>
+            </w:r>
+          </w:p>
+        </w:tc>
+        <w:tc>
+          <w:tcPr>
+            <w:tcW w:type="dxa" w:w="1904"/>
+          </w:tcPr>
+          <w:p>
+            <w:pPr>
+              <w:spacing w:after="0" w:before="0"/>
+            </w:pPr>
+            <w:r/>
+            <w:r>
+              <w:rPr>
+                <w:rFonts w:ascii="Times New Roman" w:hAnsi="Times New Roman" w:eastAsia="Times New Roman"/>
+                <w:i w:val="0"/>
+                <w:color w:val="000000"/>
+                <w:sz w:val="20"/>
+              </w:rPr>
+              <w:t>0.929</w:t>
+            </w:r>
+          </w:p>
+        </w:tc>
+        <w:tc>
+          <w:tcPr>
+            <w:tcW w:type="dxa" w:w="1904"/>
+          </w:tcPr>
+          <w:p>
+            <w:pPr>
+              <w:spacing w:after="0" w:before="0"/>
+            </w:pPr>
+            <w:r/>
+            <w:r>
+              <w:rPr>
+                <w:rFonts w:ascii="Times New Roman" w:hAnsi="Times New Roman" w:eastAsia="Times New Roman"/>
+                <w:i w:val="0"/>
+                <w:color w:val="000000"/>
+                <w:sz w:val="20"/>
+              </w:rPr>
+              <w:t>0.824</w:t>
+            </w:r>
+          </w:p>
+        </w:tc>
+        <w:tc>
+          <w:tcPr>
+            <w:tcW w:type="dxa" w:w="1904"/>
+          </w:tcPr>
+          <w:p>
+            <w:pPr>
+              <w:spacing w:after="0" w:before="0"/>
+            </w:pPr>
+            <w:r/>
+            <w:r>
+              <w:rPr>
+                <w:rFonts w:ascii="Times New Roman" w:hAnsi="Times New Roman" w:eastAsia="Times New Roman"/>
+                <w:i w:val="0"/>
+                <w:color w:val="000000"/>
+                <w:sz w:val="20"/>
+              </w:rPr>
+              <w:t>0.938</w:t>
+            </w:r>
+          </w:p>
+        </w:tc>
+      </w:tr>
+      <w:tr>
+        <w:tc>
+          <w:tcPr>
+            <w:tcW w:type="dxa" w:w="1904"/>
+          </w:tcPr>
+          <w:p>
+            <w:pPr>
+              <w:spacing w:after="0" w:before="0"/>
+            </w:pPr>
+            <w:r/>
+            <w:r>
+              <w:rPr>
+                <w:rFonts w:ascii="Times New Roman" w:hAnsi="Times New Roman" w:eastAsia="Times New Roman"/>
+                <w:i w:val="0"/>
+                <w:color w:val="000000"/>
+                <w:sz w:val="20"/>
+              </w:rPr>
+              <w:t>Split conformal, static</w:t>
+            </w:r>
+          </w:p>
+        </w:tc>
+        <w:tc>
+          <w:tcPr>
+            <w:tcW w:type="dxa" w:w="1904"/>
+          </w:tcPr>
+          <w:p>
+            <w:pPr>
+              <w:spacing w:after="0" w:before="0"/>
+            </w:pPr>
+            <w:r/>
+            <w:r>
+              <w:rPr>
+                <w:rFonts w:ascii="Times New Roman" w:hAnsi="Times New Roman" w:eastAsia="Times New Roman"/>
+                <w:i w:val="0"/>
+                <w:color w:val="000000"/>
+                <w:sz w:val="20"/>
+              </w:rPr>
+              <w:t>0.864</w:t>
+            </w:r>
+          </w:p>
+        </w:tc>
+        <w:tc>
+          <w:tcPr>
+            <w:tcW w:type="dxa" w:w="1904"/>
+          </w:tcPr>
+          <w:p>
+            <w:pPr>
+              <w:spacing w:after="0" w:before="0"/>
+            </w:pPr>
+            <w:r/>
+            <w:r>
+              <w:rPr>
+                <w:rFonts w:ascii="Times New Roman" w:hAnsi="Times New Roman" w:eastAsia="Times New Roman"/>
+                <w:i w:val="0"/>
+                <w:color w:val="000000"/>
+                <w:sz w:val="20"/>
+              </w:rPr>
+              <w:t>0.985</w:t>
+            </w:r>
+          </w:p>
+        </w:tc>
+        <w:tc>
+          <w:tcPr>
+            <w:tcW w:type="dxa" w:w="1904"/>
+          </w:tcPr>
+          <w:p>
+            <w:pPr>
+              <w:spacing w:after="0" w:before="0"/>
+            </w:pPr>
+            <w:r/>
+            <w:r>
+              <w:rPr>
+                <w:rFonts w:ascii="Times New Roman" w:hAnsi="Times New Roman" w:eastAsia="Times New Roman"/>
+                <w:i w:val="0"/>
+                <w:color w:val="000000"/>
+                <w:sz w:val="20"/>
+              </w:rPr>
+              <w:t>0.910</w:t>
+            </w:r>
+          </w:p>
+        </w:tc>
+        <w:tc>
+          <w:tcPr>
+            <w:tcW w:type="dxa" w:w="1904"/>
+          </w:tcPr>
+          <w:p>
+            <w:pPr>
+              <w:spacing w:after="0" w:before="0"/>
+            </w:pPr>
+            <w:r/>
+            <w:r>
+              <w:rPr>
+                <w:rFonts w:ascii="Times New Roman" w:hAnsi="Times New Roman" w:eastAsia="Times New Roman"/>
+                <w:i w:val="0"/>
+                <w:color w:val="000000"/>
+                <w:sz w:val="20"/>
+              </w:rPr>
+              <w:t>0.985</w:t>
+            </w:r>
+          </w:p>
+        </w:tc>
+      </w:tr>
+      <w:tr>
+        <w:tc>
+          <w:tcPr>
+            <w:tcW w:type="dxa" w:w="1904"/>
+          </w:tcPr>
+          <w:p>
+            <w:pPr>
+              <w:spacing w:after="0" w:before="0"/>
+            </w:pPr>
+            <w:r/>
+            <w:r>
+              <w:rPr>
+                <w:rFonts w:ascii="Times New Roman" w:hAnsi="Times New Roman" w:eastAsia="Times New Roman"/>
+                <w:i w:val="0"/>
+                <w:color w:val="000000"/>
+                <w:sz w:val="20"/>
+              </w:rPr>
+              <w:t>Rolling, volatility-normalised</w:t>
+            </w:r>
+          </w:p>
+        </w:tc>
+        <w:tc>
+          <w:tcPr>
+            <w:tcW w:type="dxa" w:w="1904"/>
+          </w:tcPr>
+          <w:p>
+            <w:pPr>
+              <w:spacing w:after="0" w:before="0"/>
+            </w:pPr>
+            <w:r/>
+            <w:r>
+              <w:rPr>
+                <w:rFonts w:ascii="Times New Roman" w:hAnsi="Times New Roman" w:eastAsia="Times New Roman"/>
+                <w:i w:val="0"/>
+                <w:color w:val="000000"/>
+                <w:sz w:val="20"/>
+              </w:rPr>
+              <w:t>0.808</w:t>
+            </w:r>
+          </w:p>
+        </w:tc>
+        <w:tc>
+          <w:tcPr>
+            <w:tcW w:type="dxa" w:w="1904"/>
+          </w:tcPr>
+          <w:p>
+            <w:pPr>
+              <w:spacing w:after="0" w:before="0"/>
+            </w:pPr>
+            <w:r/>
+            <w:r>
+              <w:rPr>
+                <w:rFonts w:ascii="Times New Roman" w:hAnsi="Times New Roman" w:eastAsia="Times New Roman"/>
+                <w:i w:val="0"/>
+                <w:color w:val="000000"/>
+                <w:sz w:val="20"/>
+              </w:rPr>
+              <w:t>0.957</w:t>
+            </w:r>
+          </w:p>
+        </w:tc>
+        <w:tc>
+          <w:tcPr>
+            <w:tcW w:type="dxa" w:w="1904"/>
+          </w:tcPr>
+          <w:p>
+            <w:pPr>
+              <w:spacing w:after="0" w:before="0"/>
+            </w:pPr>
+            <w:r/>
+            <w:r>
+              <w:rPr>
+                <w:rFonts w:ascii="Times New Roman" w:hAnsi="Times New Roman" w:eastAsia="Times New Roman"/>
+                <w:i w:val="0"/>
+                <w:color w:val="000000"/>
+                <w:sz w:val="20"/>
+              </w:rPr>
+              <w:t>0.807</w:t>
+            </w:r>
+          </w:p>
+        </w:tc>
+        <w:tc>
+          <w:tcPr>
+            <w:tcW w:type="dxa" w:w="1904"/>
+          </w:tcPr>
+          <w:p>
+            <w:pPr>
+              <w:spacing w:after="0" w:before="0"/>
+            </w:pPr>
+            <w:r/>
+            <w:r>
+              <w:rPr>
+                <w:rFonts w:ascii="Times New Roman" w:hAnsi="Times New Roman" w:eastAsia="Times New Roman"/>
+                <w:i w:val="0"/>
+                <w:color w:val="000000"/>
+                <w:sz w:val="20"/>
+              </w:rPr>
+              <w:t>0.943</w:t>
+            </w:r>
+          </w:p>
+        </w:tc>
+      </w:tr>
+      <w:tr>
+        <w:tc>
+          <w:tcPr>
+            <w:tcW w:type="dxa" w:w="1904"/>
+          </w:tcPr>
+          <w:p>
+            <w:pPr>
+              <w:spacing w:after="0" w:before="0"/>
+            </w:pPr>
+            <w:r/>
+            <w:r>
+              <w:rPr>
+                <w:rFonts w:ascii="Times New Roman" w:hAnsi="Times New Roman" w:eastAsia="Times New Roman"/>
+                <w:i w:val="0"/>
+                <w:color w:val="000000"/>
+                <w:sz w:val="20"/>
+              </w:rPr>
+              <w:t>Adaptive conformal, volatility-normalised</w:t>
+            </w:r>
+          </w:p>
+        </w:tc>
+        <w:tc>
+          <w:tcPr>
+            <w:tcW w:type="dxa" w:w="1904"/>
+          </w:tcPr>
+          <w:p>
+            <w:pPr>
+              <w:spacing w:after="0" w:before="0"/>
+            </w:pPr>
+            <w:r/>
+            <w:r>
+              <w:rPr>
+                <w:rFonts w:ascii="Times New Roman" w:hAnsi="Times New Roman" w:eastAsia="Times New Roman"/>
+                <w:i w:val="0"/>
+                <w:color w:val="000000"/>
+                <w:sz w:val="20"/>
+              </w:rPr>
+              <w:t>0.799</w:t>
+            </w:r>
+          </w:p>
+        </w:tc>
+        <w:tc>
+          <w:tcPr>
+            <w:tcW w:type="dxa" w:w="1904"/>
+          </w:tcPr>
+          <w:p>
+            <w:pPr>
+              <w:spacing w:after="0" w:before="0"/>
+            </w:pPr>
+            <w:r/>
+            <w:r>
+              <w:rPr>
+                <w:rFonts w:ascii="Times New Roman" w:hAnsi="Times New Roman" w:eastAsia="Times New Roman"/>
+                <w:i w:val="0"/>
+                <w:color w:val="000000"/>
+                <w:sz w:val="20"/>
+              </w:rPr>
+              <w:t>0.948</w:t>
+            </w:r>
+          </w:p>
+        </w:tc>
+        <w:tc>
+          <w:tcPr>
+            <w:tcW w:type="dxa" w:w="1904"/>
+          </w:tcPr>
+          <w:p>
+            <w:pPr>
+              <w:spacing w:after="0" w:before="0"/>
+            </w:pPr>
+            <w:r/>
+            <w:r>
+              <w:rPr>
+                <w:rFonts w:ascii="Times New Roman" w:hAnsi="Times New Roman" w:eastAsia="Times New Roman"/>
+                <w:i w:val="0"/>
+                <w:color w:val="000000"/>
+                <w:sz w:val="20"/>
+              </w:rPr>
+              <w:t>0.798</w:t>
+            </w:r>
+          </w:p>
+        </w:tc>
+        <w:tc>
+          <w:tcPr>
+            <w:tcW w:type="dxa" w:w="1904"/>
+          </w:tcPr>
+          <w:p>
+            <w:pPr>
+              <w:spacing w:after="0" w:before="0"/>
+            </w:pPr>
+            <w:r/>
+            <w:r>
+              <w:rPr>
+                <w:rFonts w:ascii="Times New Roman" w:hAnsi="Times New Roman" w:eastAsia="Times New Roman"/>
+                <w:i w:val="0"/>
+                <w:color w:val="000000"/>
+                <w:sz w:val="20"/>
+              </w:rPr>
+              <w:t>0.947</w:t>
+            </w:r>
+          </w:p>
+        </w:tc>
+      </w:tr>
+    </w:tbl>
+    <w:p/>
+    <w:p>
+      <w:pPr>
+        <w:spacing w:after="160" w:line="276" w:lineRule="auto"/>
+      </w:pPr>
+      <w:r>
+        <w:rPr>
+          <w:rFonts w:ascii="Times New Roman" w:hAnsi="Times New Roman" w:eastAsia="Times New Roman"/>
+          <w:i w:val="0"/>
+          <w:color w:val="000000"/>
+          <w:sz w:val="24"/>
+        </w:rPr>
+        <w:t>Adaptive conformal is closest to the nominal level on average. Static intervals over-cover</w:t>
       </w:r>
     </w:p>
     <w:p>
+      <w:pPr>
+        <w:spacing w:after="160" w:line="276" w:lineRule="auto"/>
+      </w:pPr>
       <w:r>
-        <w:t>LLM reports will be assessed using numerical consistency, valid evidence links, unsupported-claim frequency, correct expression of uncertainty and appropriate abstention. A stratified subset will receive blinded human review using a published rubric; agreement between reviewers will be reported. No single automated LLM judge will establish explanation correctness.</w:t>
+        <w:rPr>
+          <w:rFonts w:ascii="Times New Roman" w:hAnsi="Times New Roman" w:eastAsia="Times New Roman"/>
+          <w:i w:val="0"/>
+          <w:color w:val="000000"/>
+          <w:sz w:val="24"/>
+        </w:rPr>
+        <w:t>because 2018–2022 was more volatile than the test years. Inside volatility terciles defined on</w:t>
       </w:r>
     </w:p>
     <w:p>
       <w:pPr>
-        <w:pStyle w:val="Heading2"/>
+        <w:spacing w:after="160" w:line="276" w:lineRule="auto"/>
       </w:pPr>
       <w:r>
-        <w:t>5.3 Decision support and ablations</w:t>
+        <w:rPr>
+          <w:rFonts w:ascii="Times New Roman" w:hAnsi="Times New Roman" w:eastAsia="Times New Roman"/>
+          <w:i w:val="0"/>
+          <w:color w:val="000000"/>
+          <w:sz w:val="24"/>
+        </w:rPr>
+        <w:t>the validation segment, the normalised adaptive intervals at horizon 5 and 80% cover about</w:t>
       </w:r>
     </w:p>
     <w:p>
+      <w:pPr>
+        <w:spacing w:after="160" w:line="276" w:lineRule="auto"/>
+      </w:pPr>
       <w:r>
-        <w:t>The initial decision benchmark will use a reproducible inventory-planning simulation with fixed shortage and holding costs. It will compare a fixed-template report and the LLM report using the same forecast distribution, available actions and decision constraints. Executable recommendations must pass the same constraint checks. Cost, regret relative to a hindsight reference and constraint violations will be reported. Hindsight will be used only for scoring, not as model input.</w:t>
+        <w:rPr>
+          <w:rFonts w:ascii="Times New Roman" w:hAnsi="Times New Roman" w:eastAsia="Times New Roman"/>
+          <w:i w:val="0"/>
+          <w:color w:val="000000"/>
+          <w:sz w:val="24"/>
+        </w:rPr>
+        <w:t>0.71–0.74 of calm origins and about 0.87–0.93 of turbulent ones. That conditional failure is</w:t>
       </w:r>
     </w:p>
     <w:p>
+      <w:pPr>
+        <w:spacing w:after="160" w:line="276" w:lineRule="auto"/>
+      </w:pPr>
       <w:r>
-        <w:t>A later consented human study, subject to institutional ethics approval and participant access, may measure decision quality, comprehension, confidence calibration and time required. Financial reports will be evaluated for evidence fidelity and uncertainty communication; real trading profitability is outside the initial study.</w:t>
+        <w:rPr>
+          <w:rFonts w:ascii="Times New Roman" w:hAnsi="Times New Roman" w:eastAsia="Times New Roman"/>
+          <w:i w:val="0"/>
+          <w:color w:val="000000"/>
+          <w:sz w:val="24"/>
+        </w:rPr>
+        <w:t>the starting point of RQ1.</w:t>
       </w:r>
     </w:p>
     <w:p>
+      <w:pPr>
+        <w:spacing w:after="160" w:line="276" w:lineRule="auto"/>
+      </w:pPr>
       <w:r>
-        <w:t>Ablations will compare: a single model versus an ensemble; fixed versus adaptive calibration; numerical template versus unconstrained LLM report versus verified LLM report; and no context versus timestamp-filtered context. Accuracy benefits will be attributed to the numerical model, while report and decision benefits will be attributed to the reporting intervention. Dataset transfer will distinguish re-training across domains from genuine zero-shot transfer.</w:t>
+        <w:rPr>
+          <w:rFonts w:ascii="Times New Roman" w:hAnsi="Times New Roman" w:eastAsia="Times New Roman"/>
+          <w:i w:val="0"/>
+          <w:color w:val="000000"/>
+          <w:sz w:val="24"/>
+        </w:rPr>
+        <w:t>Limits, so they are not discovered later: two series, one feature family, one test window,</w:t>
       </w:r>
     </w:p>
     <w:p>
       <w:pPr>
-        <w:pStyle w:val="Heading1"/>
+        <w:spacing w:after="160" w:line="276" w:lineRule="auto"/>
       </w:pPr>
       <w:r>
-        <w:t>6 Expected contributions and feasibility</w:t>
+        <w:rPr>
+          <w:rFonts w:ascii="Times New Roman" w:hAnsi="Times New Roman" w:eastAsia="Times New Roman"/>
+          <w:i w:val="0"/>
+          <w:color w:val="000000"/>
+          <w:sz w:val="24"/>
+        </w:rPr>
+        <w:t>and overlapping horizons. The delayed-feedback update does not inherit the coverage guarantee</w:t>
       </w:r>
     </w:p>
     <w:p>
+      <w:pPr>
+        <w:spacing w:after="160" w:line="276" w:lineRule="auto"/>
+      </w:pPr>
       <w:r>
-        <w:t>I aim to contribute an auditable evaluation protocol, a tested uncertainty-calibration strategy, an evidence schema and verification mechanism for forecast reports, and empirical findings on the added value and limits of LLM decision support. Any methodological contribution will be judged against existing work and established through experiments. A useful outcome may be a clear boundary showing where simpler models or template reports are preferable.</w:t>
+        <w:rPr>
+          <w:rFonts w:ascii="Times New Roman" w:hAnsi="Times New Roman" w:eastAsia="Times New Roman"/>
+          <w:i w:val="0"/>
+          <w:color w:val="000000"/>
+          <w:sz w:val="24"/>
+        </w:rPr>
+        <w:t>of the original adaptive conformal algorithm. The same history was inspected informally before</w:t>
       </w:r>
     </w:p>
     <w:p>
+      <w:pPr>
+        <w:spacing w:after="160" w:line="276" w:lineRule="auto"/>
+      </w:pPr>
       <w:r>
-        <w:t>My preparation includes a First Class Honours degree in Computing Science, a database and deep-learning final-year project on café revenue, independent Bitcoin and VN30 experiments, open-source forecasting software and AI teaching. These provide an implementation starting point. The current repository explicitly distinguishes a runnable synthetic benchmark from historical exploratory notebooks; neither is presented here as validated evidence of real-market superiority. Existing notebooks will be audited and reimplemented within the common protocol before they contribute to findings.</w:t>
+        <w:rPr>
+          <w:rFonts w:ascii="Times New Roman" w:hAnsi="Times New Roman" w:eastAsia="Times New Roman"/>
+          <w:i w:val="0"/>
+          <w:color w:val="000000"/>
+          <w:sz w:val="24"/>
+        </w:rPr>
+        <w:t>the frozen run, so the test segment is not a never-seen sample. Provider, download date and</w:t>
       </w:r>
     </w:p>
     <w:p>
       <w:pPr>
-        <w:pStyle w:val="Heading1"/>
-        <w:pageBreakBefore/>
+        <w:spacing w:after="160" w:line="276" w:lineRule="auto"/>
       </w:pPr>
       <w:r>
-        <w:t>7 Provisional four-year plan</w:t>
+        <w:rPr>
+          <w:rFonts w:ascii="Times New Roman" w:hAnsi="Times New Roman" w:eastAsia="Times New Roman"/>
+          <w:i w:val="0"/>
+          <w:color w:val="000000"/>
+          <w:sz w:val="24"/>
+        </w:rPr>
+        <w:t>licence are unrecorded. Four VN30 test rows are dated Saturday or Sunday and must be</w:t>
       </w:r>
     </w:p>
     <w:p>
       <w:pPr>
-        <w:pStyle w:val="ListBullet"/>
-        <w:keepNext/>
-      </w:pPr>
-      <w:r/>
+        <w:spacing w:after="160" w:line="276" w:lineRule="auto"/>
+      </w:pPr>
       <w:r>
         <w:rPr>
-          <w:b/>
+          <w:rFonts w:ascii="Times New Roman" w:hAnsi="Times New Roman" w:eastAsia="Times New Roman"/>
+          <w:i w:val="0"/>
+          <w:color w:val="000000"/>
+          <w:sz w:val="24"/>
         </w:rPr>
-        <w:t>Year 1:</w:t>
-      </w:r>
-      <w:r>
-        <w:t xml:space="preserve"> literature review; formalise the problem and protocol; obtain licensed snapshots; reproduce baselines and repair exploratory evaluations.</w:t>
+        <w:t>reconciled with the exchange calendar before any calendar claim. Market files are not in the</w:t>
       </w:r>
     </w:p>
     <w:p>
       <w:pPr>
-        <w:pStyle w:val="ListBullet"/>
-        <w:keepNext/>
-      </w:pPr>
-      <w:r/>
+        <w:spacing w:after="160" w:line="276" w:lineRule="auto"/>
+      </w:pPr>
       <w:r>
         <w:rPr>
-          <w:b/>
+          <w:rFonts w:ascii="Times New Roman" w:hAnsi="Times New Roman" w:eastAsia="Times New Roman"/>
+          <w:i w:val="0"/>
+          <w:color w:val="000000"/>
+          <w:sz w:val="24"/>
         </w:rPr>
-        <w:t>Year 2:</w:t>
-      </w:r>
-      <w:r>
-        <w:t xml:space="preserve"> compare forecasting families; develop and evaluate horizon-specific uncertainty calibration; document robustness and failures.</w:t>
+        <w:t>repository ([data card](../data.md), [results note](../preliminary_results.md)).</w:t>
       </w:r>
     </w:p>
     <w:p>
       <w:pPr>
-        <w:pStyle w:val="ListBullet"/>
-        <w:keepNext/>
-      </w:pPr>
-      <w:r/>
+        <w:spacing w:before="240" w:after="80"/>
+      </w:pPr>
       <w:r>
         <w:rPr>
+          <w:rFonts w:ascii="Times New Roman" w:hAnsi="Times New Roman" w:eastAsia="Times New Roman"/>
           <w:b/>
+          <w:i w:val="0"/>
+          <w:color w:val="000000"/>
+          <w:sz w:val="26"/>
         </w:rPr>
-        <w:t>Year 3:</w:t>
-      </w:r>
-      <w:r>
-        <w:t xml:space="preserve"> implement verified LLM reports; run ablations and decision simulations; conduct a human study if approved and feasible.</w:t>
+        <w:t>5. Proposed work</w:t>
       </w:r>
     </w:p>
     <w:p>
       <w:pPr>
-        <w:pStyle w:val="ListBullet"/>
-      </w:pPr>
-      <w:r/>
+        <w:spacing w:after="160" w:line="276" w:lineRule="auto"/>
+      </w:pPr>
       <w:r>
         <w:rPr>
+          <w:rFonts w:ascii="Times New Roman" w:hAnsi="Times New Roman" w:eastAsia="Times New Roman"/>
           <w:b/>
+          <w:color w:val="000000"/>
+          <w:sz w:val="24"/>
         </w:rPr>
-        <w:t>Year 4:</w:t>
+        <w:t>RQ1.</w:t>
       </w:r>
       <w:r>
-        <w:t xml:space="preserve"> replicate across datasets and regimes; consolidate findings, release reproducible artefacts and complete the thesis.</w:t>
+        <w:rPr>
+          <w:rFonts w:ascii="Times New Roman" w:hAnsi="Times New Roman" w:eastAsia="Times New Roman"/>
+          <w:i w:val="0"/>
+          <w:color w:val="000000"/>
+          <w:sz w:val="24"/>
+        </w:rPr>
+        <w:t xml:space="preserve"> Keep the existing protocol. On the validation segment only, fit a scale for interval</w:t>
       </w:r>
     </w:p>
     <w:p>
+      <w:pPr>
+        <w:spacing w:after="160" w:line="276" w:lineRule="auto"/>
+      </w:pPr>
       <w:r>
-        <w:t>The minimum viable thesis will prioritise two domains, a small model set and one decision task. Compute constraints will be managed through bounded search, sparse Gaussian processes, limited neural architectures and cached LLM experiments. Poor calibration, unavailable contextual data or unreliable LLM outputs will trigger simpler baselines or template fallback rather than unverified claims.</w:t>
+        <w:rPr>
+          <w:rFonts w:ascii="Times New Roman" w:hAnsi="Times New Roman" w:eastAsia="Times New Roman"/>
+          <w:i w:val="0"/>
+          <w:color w:val="000000"/>
+          <w:sz w:val="24"/>
+        </w:rPr>
+        <w:t>width: a monotone function of trailing EWMA volatility, or a quantile regression of the</w:t>
       </w:r>
     </w:p>
     <w:p>
       <w:pPr>
-        <w:pStyle w:val="Heading1"/>
+        <w:spacing w:after="160" w:line="276" w:lineRule="auto"/>
       </w:pPr>
       <w:r>
-        <w:t>8 Reproducibility and responsible use</w:t>
+        <w:rPr>
+          <w:rFonts w:ascii="Times New Roman" w:hAnsi="Times New Roman" w:eastAsia="Times New Roman"/>
+          <w:i w:val="0"/>
+          <w:color w:val="000000"/>
+          <w:sz w:val="24"/>
+        </w:rPr>
+        <w:t>absolute residual on volatility and horizon. Compare it with static split conformal, rolling</w:t>
       </w:r>
     </w:p>
     <w:p>
+      <w:pPr>
+        <w:spacing w:after="160" w:line="276" w:lineRule="auto"/>
+      </w:pPr>
       <w:r>
-        <w:t>Public releases will include code, environment specifications, split manifests, prompts, schemas, verification rules and permitted evaluation artefacts. Licensed data will be redistributed only where authorised; otherwise acquisition instructions and hashes will be supplied. Model/API versions and knowledge-cutoff limitations will be recorded because retrospective LLM tests may contain pretraining contamination. Where possible, prospective evaluation or local models with documented training cutoffs will complement retrospective tests. Confidential business data and human-study records will remain access-controlled.</w:t>
+        <w:rPr>
+          <w:rFonts w:ascii="Times New Roman" w:hAnsi="Times New Roman" w:eastAsia="Times New Roman"/>
+          <w:i w:val="0"/>
+          <w:color w:val="000000"/>
+          <w:sz w:val="24"/>
+        </w:rPr>
+        <w:t>split conformal, an EnbPI-style ensemble where the compute budget allows, and adaptive</w:t>
       </w:r>
     </w:p>
     <w:p>
+      <w:pPr>
+        <w:spacing w:after="160" w:line="276" w:lineRule="auto"/>
+      </w:pPr>
       <w:r>
-        <w:t>This document describes proposed work and expected contributions. It does not report completed PhD experiments, guaranteed accuracy or an agreed supervisory arrangement.</w:t>
+        <w:rPr>
+          <w:rFonts w:ascii="Times New Roman" w:hAnsi="Times New Roman" w:eastAsia="Times New Roman"/>
+          <w:i w:val="0"/>
+          <w:color w:val="000000"/>
+          <w:sz w:val="24"/>
+        </w:rPr>
+        <w:t>conformal inference [10, 12]. Report marginal coverage, coverage by predeclared volatility</w:t>
       </w:r>
     </w:p>
     <w:p>
       <w:pPr>
-        <w:pStyle w:val="Heading1"/>
+        <w:spacing w:after="160" w:line="276" w:lineRule="auto"/>
       </w:pPr>
       <w:r>
+        <w:rPr>
+          <w:rFonts w:ascii="Times New Roman" w:hAnsi="Times New Roman" w:eastAsia="Times New Roman"/>
+          <w:i w:val="0"/>
+          <w:color w:val="000000"/>
+          <w:sz w:val="24"/>
+        </w:rPr>
+        <w:t>regime, mean width and interval score. Freeze the scale and any step size before the test</w:t>
+      </w:r>
+    </w:p>
+    <w:p>
+      <w:pPr>
+        <w:spacing w:after="160" w:line="276" w:lineRule="auto"/>
+      </w:pPr>
+      <w:r>
+        <w:rPr>
+          <w:rFonts w:ascii="Times New Roman" w:hAnsi="Times New Roman" w:eastAsia="Times New Roman"/>
+          <w:i w:val="0"/>
+          <w:color w:val="000000"/>
+          <w:sz w:val="24"/>
+        </w:rPr>
+        <w:t>segment is opened.</w:t>
+      </w:r>
+    </w:p>
+    <w:p>
+      <w:pPr>
+        <w:spacing w:after="160" w:line="276" w:lineRule="auto"/>
+      </w:pPr>
+      <w:r>
+        <w:rPr>
+          <w:rFonts w:ascii="Times New Roman" w:hAnsi="Times New Roman" w:eastAsia="Times New Roman"/>
+          <w:b/>
+          <w:color w:val="000000"/>
+          <w:sz w:val="24"/>
+        </w:rPr>
+        <w:t>RQ2, after a frozen interval exists.</w:t>
+      </w:r>
+      <w:r>
+        <w:rPr>
+          <w:rFonts w:ascii="Times New Roman" w:hAnsi="Times New Roman" w:eastAsia="Times New Roman"/>
+          <w:i w:val="0"/>
+          <w:color w:val="000000"/>
+          <w:sz w:val="24"/>
+        </w:rPr>
+        <w:t xml:space="preserve"> The report receives an evidence packet: target,</w:t>
+      </w:r>
+    </w:p>
+    <w:p>
+      <w:pPr>
+        <w:spacing w:after="160" w:line="276" w:lineRule="auto"/>
+      </w:pPr>
+      <w:r>
+        <w:rPr>
+          <w:rFonts w:ascii="Times New Roman" w:hAnsi="Times New Roman" w:eastAsia="Times New Roman"/>
+          <w:i w:val="0"/>
+          <w:color w:val="000000"/>
+          <w:sz w:val="24"/>
+        </w:rPr>
+        <w:t>origin time, forecast, interval, past errors, model disagreement, and allowed actions.</w:t>
+      </w:r>
+    </w:p>
+    <w:p>
+      <w:pPr>
+        <w:spacing w:after="160" w:line="276" w:lineRule="auto"/>
+      </w:pPr>
+      <w:r>
+        <w:rPr>
+          <w:rFonts w:ascii="Times New Roman" w:hAnsi="Times New Roman" w:eastAsia="Times New Roman"/>
+          <w:i w:val="0"/>
+          <w:color w:val="000000"/>
+          <w:sz w:val="24"/>
+        </w:rPr>
+        <w:t>Context is admitted only if its timestamp is at or before the origin. Each numerical claim</w:t>
+      </w:r>
+    </w:p>
+    <w:p>
+      <w:pPr>
+        <w:spacing w:after="160" w:line="276" w:lineRule="auto"/>
+      </w:pPr>
+      <w:r>
+        <w:rPr>
+          <w:rFonts w:ascii="Times New Roman" w:hAnsi="Times New Roman" w:eastAsia="Times New Roman"/>
+          <w:i w:val="0"/>
+          <w:color w:val="000000"/>
+          <w:sz w:val="24"/>
+        </w:rPr>
+        <w:t>needs an evidence identifier. Code checks every number against the packet; a failure falls</w:t>
+      </w:r>
+    </w:p>
+    <w:p>
+      <w:pPr>
+        <w:spacing w:after="160" w:line="276" w:lineRule="auto"/>
+      </w:pPr>
+      <w:r>
+        <w:rPr>
+          <w:rFonts w:ascii="Times New Roman" w:hAnsi="Times New Roman" w:eastAsia="Times New Roman"/>
+          <w:i w:val="0"/>
+          <w:color w:val="000000"/>
+          <w:sz w:val="24"/>
+        </w:rPr>
+        <w:t>back to a fixed template. The model may not change the forecast. Scores are consistency,</w:t>
+      </w:r>
+    </w:p>
+    <w:p>
+      <w:pPr>
+        <w:spacing w:after="160" w:line="276" w:lineRule="auto"/>
+      </w:pPr>
+      <w:r>
+        <w:rPr>
+          <w:rFonts w:ascii="Times New Roman" w:hAnsi="Times New Roman" w:eastAsia="Times New Roman"/>
+          <w:i w:val="0"/>
+          <w:color w:val="000000"/>
+          <w:sz w:val="24"/>
+        </w:rPr>
+        <w:t>unsupported-claim rate, abstention, and cost in an inventory simulation with fixed shortage</w:t>
+      </w:r>
+    </w:p>
+    <w:p>
+      <w:pPr>
+        <w:spacing w:after="160" w:line="276" w:lineRule="auto"/>
+      </w:pPr>
+      <w:r>
+        <w:rPr>
+          <w:rFonts w:ascii="Times New Roman" w:hAnsi="Times New Roman" w:eastAsia="Times New Roman"/>
+          <w:i w:val="0"/>
+          <w:color w:val="000000"/>
+          <w:sz w:val="24"/>
+        </w:rPr>
+        <w:t>and holding costs. Hindsight is used only for scoring. A human study needs ethics approval.</w:t>
+      </w:r>
+    </w:p>
+    <w:p>
+      <w:pPr>
+        <w:spacing w:after="160" w:line="276" w:lineRule="auto"/>
+      </w:pPr>
+      <w:r>
+        <w:rPr>
+          <w:rFonts w:ascii="Times New Roman" w:hAnsi="Times New Roman" w:eastAsia="Times New Roman"/>
+          <w:i w:val="0"/>
+          <w:color w:val="000000"/>
+          <w:sz w:val="24"/>
+        </w:rPr>
+        <w:t>Further model families enter only as a check that the interval result does not depend on the</w:t>
+      </w:r>
+    </w:p>
+    <w:p>
+      <w:pPr>
+        <w:spacing w:after="160" w:line="276" w:lineRule="auto"/>
+      </w:pPr>
+      <w:r>
+        <w:rPr>
+          <w:rFonts w:ascii="Times New Roman" w:hAnsi="Times New Roman" w:eastAsia="Times New Roman"/>
+          <w:i w:val="0"/>
+          <w:color w:val="000000"/>
+          <w:sz w:val="24"/>
+        </w:rPr>
+        <w:t>centre. An LLM is not added to that comparison [18].</w:t>
+      </w:r>
+    </w:p>
+    <w:p>
+      <w:pPr>
+        <w:spacing w:before="240" w:after="80"/>
+      </w:pPr>
+      <w:r>
+        <w:rPr>
+          <w:rFonts w:ascii="Times New Roman" w:hAnsi="Times New Roman" w:eastAsia="Times New Roman"/>
+          <w:b/>
+          <w:i w:val="0"/>
+          <w:color w:val="000000"/>
+          <w:sz w:val="26"/>
+        </w:rPr>
+        <w:t>6. Data and evaluation rules</w:t>
+      </w:r>
+    </w:p>
+    <w:p>
+      <w:pPr>
+        <w:spacing w:after="160" w:line="276" w:lineRule="auto"/>
+      </w:pPr>
+      <w:r>
+        <w:rPr>
+          <w:rFonts w:ascii="Times New Roman" w:hAnsi="Times New Roman" w:eastAsia="Times New Roman"/>
+          <w:i w:val="0"/>
+          <w:color w:val="000000"/>
+          <w:sz w:val="24"/>
+        </w:rPr>
+        <w:t>Before any new test run, the VN30 and BID cards will name the provider, the calendar, the</w:t>
+      </w:r>
+    </w:p>
+    <w:p>
+      <w:pPr>
+        <w:spacing w:after="160" w:line="276" w:lineRule="auto"/>
+      </w:pPr>
+      <w:r>
+        <w:rPr>
+          <w:rFonts w:ascii="Times New Roman" w:hAnsi="Times New Roman" w:eastAsia="Times New Roman"/>
+          <w:i w:val="0"/>
+          <w:color w:val="000000"/>
+          <w:sz w:val="24"/>
+        </w:rPr>
+        <w:t>adjustment policy and the usage rights, or the series will not be used in a submitted result.</w:t>
+      </w:r>
+    </w:p>
+    <w:p>
+      <w:pPr>
+        <w:spacing w:after="160" w:line="276" w:lineRule="auto"/>
+      </w:pPr>
+      <w:r>
+        <w:rPr>
+          <w:rFonts w:ascii="Times New Roman" w:hAnsi="Times New Roman" w:eastAsia="Times New Roman"/>
+          <w:i w:val="0"/>
+          <w:color w:val="000000"/>
+          <w:sz w:val="24"/>
+        </w:rPr>
+        <w:t>A second domain, if reached, will be a public licensed demand benchmark chosen before fitting,</w:t>
+      </w:r>
+    </w:p>
+    <w:p>
+      <w:pPr>
+        <w:spacing w:after="160" w:line="276" w:lineRule="auto"/>
+      </w:pPr>
+      <w:r>
+        <w:rPr>
+          <w:rFonts w:ascii="Times New Roman" w:hAnsi="Times New Roman" w:eastAsia="Times New Roman"/>
+          <w:i w:val="0"/>
+          <w:color w:val="000000"/>
+          <w:sz w:val="24"/>
+        </w:rPr>
+        <w:t>with the series list fixed in advance. Horizons stay in observations, not calendar days.</w:t>
+      </w:r>
+    </w:p>
+    <w:p>
+      <w:pPr>
+        <w:spacing w:after="160" w:line="276" w:lineRule="auto"/>
+      </w:pPr>
+      <w:r>
+        <w:rPr>
+          <w:rFonts w:ascii="Times New Roman" w:hAnsi="Times New Roman" w:eastAsia="Times New Roman"/>
+          <w:i w:val="0"/>
+          <w:color w:val="000000"/>
+          <w:sz w:val="24"/>
+        </w:rPr>
+        <w:t>Fit, selection, calibration and the final window are chronological. Overlapping targets are</w:t>
+      </w:r>
+    </w:p>
+    <w:p>
+      <w:pPr>
+        <w:spacing w:after="160" w:line="276" w:lineRule="auto"/>
+      </w:pPr>
+      <w:r>
+        <w:rPr>
+          <w:rFonts w:ascii="Times New Roman" w:hAnsi="Times New Roman" w:eastAsia="Times New Roman"/>
+          <w:i w:val="0"/>
+          <w:color w:val="000000"/>
+          <w:sz w:val="24"/>
+        </w:rPr>
+        <w:t>separated by a gap at each boundary. A change of rule after the final window opens requires a</w:t>
+      </w:r>
+    </w:p>
+    <w:p>
+      <w:pPr>
+        <w:spacing w:after="160" w:line="276" w:lineRule="auto"/>
+      </w:pPr>
+      <w:r>
+        <w:rPr>
+          <w:rFonts w:ascii="Times New Roman" w:hAnsi="Times New Roman" w:eastAsia="Times New Roman"/>
+          <w:i w:val="0"/>
+          <w:color w:val="000000"/>
+          <w:sz w:val="24"/>
+        </w:rPr>
+        <w:t>new prospective window.</w:t>
+      </w:r>
+    </w:p>
+    <w:p>
+      <w:pPr>
+        <w:spacing w:after="160" w:line="276" w:lineRule="auto"/>
+      </w:pPr>
+      <w:r>
+        <w:rPr>
+          <w:rFonts w:ascii="Times New Roman" w:hAnsi="Times New Roman" w:eastAsia="Times New Roman"/>
+          <w:i w:val="0"/>
+          <w:color w:val="000000"/>
+          <w:sz w:val="24"/>
+        </w:rPr>
+        <w:t>Point metrics are MAE, RMSE and MASE, with the MASE denominator fitted before the test</w:t>
+      </w:r>
+    </w:p>
+    <w:p>
+      <w:pPr>
+        <w:spacing w:after="160" w:line="276" w:lineRule="auto"/>
+      </w:pPr>
+      <w:r>
+        <w:rPr>
+          <w:rFonts w:ascii="Times New Roman" w:hAnsi="Times New Roman" w:eastAsia="Times New Roman"/>
+          <w:i w:val="0"/>
+          <w:color w:val="000000"/>
+          <w:sz w:val="24"/>
+        </w:rPr>
+        <w:t>segment. MAPE is secondary and is not used on returns. Interval metrics are coverage at 80%</w:t>
+      </w:r>
+    </w:p>
+    <w:p>
+      <w:pPr>
+        <w:spacing w:after="160" w:line="276" w:lineRule="auto"/>
+      </w:pPr>
+      <w:r>
+        <w:rPr>
+          <w:rFonts w:ascii="Times New Roman" w:hAnsi="Times New Roman" w:eastAsia="Times New Roman"/>
+          <w:i w:val="0"/>
+          <w:color w:val="000000"/>
+          <w:sz w:val="24"/>
+        </w:rPr>
+        <w:t>and 95%, mean width, interval score, and pinball loss where the model emits a quantile.</w:t>
+      </w:r>
+    </w:p>
+    <w:p>
+      <w:pPr>
+        <w:spacing w:after="160" w:line="276" w:lineRule="auto"/>
+      </w:pPr>
+      <w:r>
+        <w:rPr>
+          <w:rFonts w:ascii="Times New Roman" w:hAnsi="Times New Roman" w:eastAsia="Times New Roman"/>
+          <w:i w:val="0"/>
+          <w:color w:val="000000"/>
+          <w:sz w:val="24"/>
+        </w:rPr>
+        <w:t>Differences use a block bootstrap and a Diebold–Mariano test, with Holm correction inside each</w:t>
+      </w:r>
+    </w:p>
+    <w:p>
+      <w:pPr>
+        <w:spacing w:after="160" w:line="276" w:lineRule="auto"/>
+      </w:pPr>
+      <w:r>
+        <w:rPr>
+          <w:rFonts w:ascii="Times New Roman" w:hAnsi="Times New Roman" w:eastAsia="Times New Roman"/>
+          <w:i w:val="0"/>
+          <w:color w:val="000000"/>
+          <w:sz w:val="24"/>
+        </w:rPr>
+        <w:t>family of tests. Failed fits and runtime are reported with the best cell, not instead of it.</w:t>
+      </w:r>
+    </w:p>
+    <w:p>
+      <w:pPr>
+        <w:spacing w:before="240" w:after="80"/>
+      </w:pPr>
+      <w:r>
+        <w:rPr>
+          <w:rFonts w:ascii="Times New Roman" w:hAnsi="Times New Roman" w:eastAsia="Times New Roman"/>
+          <w:b/>
+          <w:i w:val="0"/>
+          <w:color w:val="000000"/>
+          <w:sz w:val="26"/>
+        </w:rPr>
+        <w:t>7. Contribution, feasibility and plan</w:t>
+      </w:r>
+    </w:p>
+    <w:p>
+      <w:pPr>
+        <w:spacing w:after="160" w:line="276" w:lineRule="auto"/>
+      </w:pPr>
+      <w:r>
+        <w:rPr>
+          <w:rFonts w:ascii="Times New Roman" w:hAnsi="Times New Roman" w:eastAsia="Times New Roman"/>
+          <w:i w:val="0"/>
+          <w:color w:val="000000"/>
+          <w:sz w:val="24"/>
+        </w:rPr>
+        <w:t>Three contributions are in view. The first is already in hand: an audited protocol and a</w:t>
+      </w:r>
+    </w:p>
+    <w:p>
+      <w:pPr>
+        <w:spacing w:after="160" w:line="276" w:lineRule="auto"/>
+      </w:pPr>
+      <w:r>
+        <w:rPr>
+          <w:rFonts w:ascii="Times New Roman" w:hAnsi="Times New Roman" w:eastAsia="Times New Roman"/>
+          <w:i w:val="0"/>
+          <w:color w:val="000000"/>
+          <w:sz w:val="24"/>
+        </w:rPr>
+        <w:t>public negative result against persistence. The second is a calibration comparison aimed at</w:t>
+      </w:r>
+    </w:p>
+    <w:p>
+      <w:pPr>
+        <w:spacing w:after="160" w:line="276" w:lineRule="auto"/>
+      </w:pPr>
+      <w:r>
+        <w:rPr>
+          <w:rFonts w:ascii="Times New Roman" w:hAnsi="Times New Roman" w:eastAsia="Times New Roman"/>
+          <w:i w:val="0"/>
+          <w:color w:val="000000"/>
+          <w:sz w:val="24"/>
+        </w:rPr>
+        <w:t>conditional coverage under a volatility shift, which marginal adaptive conformal did not</w:t>
+      </w:r>
+    </w:p>
+    <w:p>
+      <w:pPr>
+        <w:spacing w:after="160" w:line="276" w:lineRule="auto"/>
+      </w:pPr>
+      <w:r>
+        <w:rPr>
+          <w:rFonts w:ascii="Times New Roman" w:hAnsi="Times New Roman" w:eastAsia="Times New Roman"/>
+          <w:i w:val="0"/>
+          <w:color w:val="000000"/>
+          <w:sz w:val="24"/>
+        </w:rPr>
+        <w:t>solve. The third is an evidence schema and a checker for forecast reports, scored against a</w:t>
+      </w:r>
+    </w:p>
+    <w:p>
+      <w:pPr>
+        <w:spacing w:after="160" w:line="276" w:lineRule="auto"/>
+      </w:pPr>
+      <w:r>
+        <w:rPr>
+          <w:rFonts w:ascii="Times New Roman" w:hAnsi="Times New Roman" w:eastAsia="Times New Roman"/>
+          <w:i w:val="0"/>
+          <w:color w:val="000000"/>
+          <w:sz w:val="24"/>
+        </w:rPr>
+        <w:t>template that shows the same numbers. A useful outcome may be a boundary: a simpler interval,</w:t>
+      </w:r>
+    </w:p>
+    <w:p>
+      <w:pPr>
+        <w:spacing w:after="160" w:line="276" w:lineRule="auto"/>
+      </w:pPr>
+      <w:r>
+        <w:rPr>
+          <w:rFonts w:ascii="Times New Roman" w:hAnsi="Times New Roman" w:eastAsia="Times New Roman"/>
+          <w:i w:val="0"/>
+          <w:color w:val="000000"/>
+          <w:sz w:val="24"/>
+        </w:rPr>
+        <w:t>or a template, is the better tool.</w:t>
+      </w:r>
+    </w:p>
+    <w:p>
+      <w:pPr>
+        <w:spacing w:after="160" w:line="276" w:lineRule="auto"/>
+      </w:pPr>
+      <w:r>
+        <w:rPr>
+          <w:rFonts w:ascii="Times New Roman" w:hAnsi="Times New Roman" w:eastAsia="Times New Roman"/>
+          <w:i w:val="0"/>
+          <w:color w:val="000000"/>
+          <w:sz w:val="24"/>
+        </w:rPr>
+        <w:t>Preparation is a First Class Honours degree in Computing Science, a final-year project on café</w:t>
+      </w:r>
+    </w:p>
+    <w:p>
+      <w:pPr>
+        <w:spacing w:after="160" w:line="276" w:lineRule="auto"/>
+      </w:pPr>
+      <w:r>
+        <w:rPr>
+          <w:rFonts w:ascii="Times New Roman" w:hAnsi="Times New Roman" w:eastAsia="Times New Roman"/>
+          <w:i w:val="0"/>
+          <w:color w:val="000000"/>
+          <w:sz w:val="24"/>
+        </w:rPr>
+        <w:t>revenue, and the repository above, with tests and continuous integration. Archived notebooks</w:t>
+      </w:r>
+    </w:p>
+    <w:p>
+      <w:pPr>
+        <w:spacing w:after="160" w:line="276" w:lineRule="auto"/>
+      </w:pPr>
+      <w:r>
+        <w:rPr>
+          <w:rFonts w:ascii="Times New Roman" w:hAnsi="Times New Roman" w:eastAsia="Times New Roman"/>
+          <w:i w:val="0"/>
+          <w:color w:val="000000"/>
+          <w:sz w:val="24"/>
+        </w:rPr>
+        <w:t>are exploratory and are not cited as validated accuracy.</w:t>
+      </w:r>
+    </w:p>
+    <w:p>
+      <w:pPr>
+        <w:spacing w:after="40" w:line="259" w:lineRule="auto"/>
+        <w:ind w:left="425"/>
+      </w:pPr>
+      <w:r>
+        <w:rPr>
+          <w:rFonts w:ascii="Times New Roman" w:hAnsi="Times New Roman" w:eastAsia="Times New Roman"/>
+          <w:i w:val="0"/>
+          <w:color w:val="000000"/>
+          <w:sz w:val="24"/>
+        </w:rPr>
+        <w:t>Year 1. Confirm provenance and reconcile the weekend-dated VN30 rows. Complete the</w:t>
+      </w:r>
+    </w:p>
+    <w:p>
+      <w:pPr>
+        <w:spacing w:after="160" w:line="276" w:lineRule="auto"/>
+      </w:pPr>
+      <w:r>
+        <w:rPr>
+          <w:rFonts w:ascii="Times New Roman" w:hAnsi="Times New Roman" w:eastAsia="Times New Roman"/>
+          <w:i w:val="0"/>
+          <w:color w:val="000000"/>
+          <w:sz w:val="24"/>
+        </w:rPr>
+        <w:t xml:space="preserve">  literature review against the list below. Run the conditional-coverage experiment on the</w:t>
+      </w:r>
+    </w:p>
+    <w:p>
+      <w:pPr>
+        <w:spacing w:after="160" w:line="276" w:lineRule="auto"/>
+      </w:pPr>
+      <w:r>
+        <w:rPr>
+          <w:rFonts w:ascii="Times New Roman" w:hAnsi="Times New Roman" w:eastAsia="Times New Roman"/>
+          <w:i w:val="0"/>
+          <w:color w:val="000000"/>
+          <w:sz w:val="24"/>
+        </w:rPr>
+        <w:t xml:space="preserve">  existing protocol.</w:t>
+      </w:r>
+    </w:p>
+    <w:p>
+      <w:pPr>
+        <w:spacing w:after="40" w:line="259" w:lineRule="auto"/>
+        <w:ind w:left="425"/>
+      </w:pPr>
+      <w:r>
+        <w:rPr>
+          <w:rFonts w:ascii="Times New Roman" w:hAnsi="Times New Roman" w:eastAsia="Times New Roman"/>
+          <w:i w:val="0"/>
+          <w:color w:val="000000"/>
+          <w:sz w:val="24"/>
+        </w:rPr>
+        <w:t>Year 2. Repeat on at least one further asset and one stress window. Compare calibration</w:t>
+      </w:r>
+    </w:p>
+    <w:p>
+      <w:pPr>
+        <w:spacing w:after="160" w:line="276" w:lineRule="auto"/>
+      </w:pPr>
+      <w:r>
+        <w:rPr>
+          <w:rFonts w:ascii="Times New Roman" w:hAnsi="Times New Roman" w:eastAsia="Times New Roman"/>
+          <w:i w:val="0"/>
+          <w:color w:val="000000"/>
+          <w:sz w:val="24"/>
+        </w:rPr>
+        <w:t xml:space="preserve">  methods. Keep the failures.</w:t>
+      </w:r>
+    </w:p>
+    <w:p>
+      <w:pPr>
+        <w:spacing w:after="40" w:line="259" w:lineRule="auto"/>
+        <w:ind w:left="425"/>
+      </w:pPr>
+      <w:r>
+        <w:rPr>
+          <w:rFonts w:ascii="Times New Roman" w:hAnsi="Times New Roman" w:eastAsia="Times New Roman"/>
+          <w:i w:val="0"/>
+          <w:color w:val="000000"/>
+          <w:sz w:val="24"/>
+        </w:rPr>
+        <w:t>Year 3. Verified reports, ablations, and the inventory simulation. A human study only if it</w:t>
+      </w:r>
+    </w:p>
+    <w:p>
+      <w:pPr>
+        <w:spacing w:after="160" w:line="276" w:lineRule="auto"/>
+      </w:pPr>
+      <w:r>
+        <w:rPr>
+          <w:rFonts w:ascii="Times New Roman" w:hAnsi="Times New Roman" w:eastAsia="Times New Roman"/>
+          <w:i w:val="0"/>
+          <w:color w:val="000000"/>
+          <w:sz w:val="24"/>
+        </w:rPr>
+        <w:t xml:space="preserve">  is approved.</w:t>
+      </w:r>
+    </w:p>
+    <w:p>
+      <w:pPr>
+        <w:spacing w:after="40" w:line="259" w:lineRule="auto"/>
+        <w:ind w:left="425"/>
+      </w:pPr>
+      <w:r>
+        <w:rPr>
+          <w:rFonts w:ascii="Times New Roman" w:hAnsi="Times New Roman" w:eastAsia="Times New Roman"/>
+          <w:i w:val="0"/>
+          <w:color w:val="000000"/>
+          <w:sz w:val="24"/>
+        </w:rPr>
+        <w:t>Year 4. Replication, public artefacts, thesis.</w:t>
+      </w:r>
+    </w:p>
+    <w:p>
+      <w:pPr>
+        <w:spacing w:after="160" w:line="276" w:lineRule="auto"/>
+      </w:pPr>
+      <w:r>
+        <w:rPr>
+          <w:rFonts w:ascii="Times New Roman" w:hAnsi="Times New Roman" w:eastAsia="Times New Roman"/>
+          <w:i w:val="0"/>
+          <w:color w:val="000000"/>
+          <w:sz w:val="24"/>
+        </w:rPr>
+        <w:t>The minimum thesis is RQ1 on the two series already in the protocol, plus the inventory</w:t>
+      </w:r>
+    </w:p>
+    <w:p>
+      <w:pPr>
+        <w:spacing w:after="160" w:line="276" w:lineRule="auto"/>
+      </w:pPr>
+      <w:r>
+        <w:rPr>
+          <w:rFonts w:ascii="Times New Roman" w:hAnsi="Times New Roman" w:eastAsia="Times New Roman"/>
+          <w:i w:val="0"/>
+          <w:color w:val="000000"/>
+          <w:sz w:val="24"/>
+        </w:rPr>
+        <w:t>comparison in RQ2 if the report layer is stable. If conditional coverage does not improve,</w:t>
+      </w:r>
+    </w:p>
+    <w:p>
+      <w:pPr>
+        <w:spacing w:after="160" w:line="276" w:lineRule="auto"/>
+      </w:pPr>
+      <w:r>
+        <w:rPr>
+          <w:rFonts w:ascii="Times New Roman" w:hAnsi="Times New Roman" w:eastAsia="Times New Roman"/>
+          <w:i w:val="0"/>
+          <w:color w:val="000000"/>
+          <w:sz w:val="24"/>
+        </w:rPr>
+        <w:t>that negative result is the finding, and the report layer is evaluated on the best simple</w:t>
+      </w:r>
+    </w:p>
+    <w:p>
+      <w:pPr>
+        <w:spacing w:after="160" w:line="276" w:lineRule="auto"/>
+      </w:pPr>
+      <w:r>
+        <w:rPr>
+          <w:rFonts w:ascii="Times New Roman" w:hAnsi="Times New Roman" w:eastAsia="Times New Roman"/>
+          <w:i w:val="0"/>
+          <w:color w:val="000000"/>
+          <w:sz w:val="24"/>
+        </w:rPr>
+        <w:t>interval rather than dropped.</w:t>
+      </w:r>
+    </w:p>
+    <w:p>
+      <w:pPr>
+        <w:spacing w:before="240" w:after="80"/>
+      </w:pPr>
+      <w:r>
+        <w:rPr>
+          <w:rFonts w:ascii="Times New Roman" w:hAnsi="Times New Roman" w:eastAsia="Times New Roman"/>
+          <w:b/>
+          <w:i w:val="0"/>
+          <w:color w:val="000000"/>
+          <w:sz w:val="26"/>
+        </w:rPr>
+        <w:t>8. Reproducibility and use</w:t>
+      </w:r>
+    </w:p>
+    <w:p>
+      <w:pPr>
+        <w:spacing w:after="160" w:line="276" w:lineRule="auto"/>
+      </w:pPr>
+      <w:r>
+        <w:rPr>
+          <w:rFonts w:ascii="Times New Roman" w:hAnsi="Times New Roman" w:eastAsia="Times New Roman"/>
+          <w:i w:val="0"/>
+          <w:color w:val="000000"/>
+          <w:sz w:val="24"/>
+        </w:rPr>
+        <w:t>Releases include code, a locked environment, split dates, prompts, schemas and verification</w:t>
+      </w:r>
+    </w:p>
+    <w:p>
+      <w:pPr>
+        <w:spacing w:after="160" w:line="276" w:lineRule="auto"/>
+      </w:pPr>
+      <w:r>
+        <w:rPr>
+          <w:rFonts w:ascii="Times New Roman" w:hAnsi="Times New Roman" w:eastAsia="Times New Roman"/>
+          <w:i w:val="0"/>
+          <w:color w:val="000000"/>
+          <w:sz w:val="24"/>
+        </w:rPr>
+        <w:t>rules. Data are redistributed only if the provider allows; otherwise the card records the hash</w:t>
+      </w:r>
+    </w:p>
+    <w:p>
+      <w:pPr>
+        <w:spacing w:after="160" w:line="276" w:lineRule="auto"/>
+      </w:pPr>
+      <w:r>
+        <w:rPr>
+          <w:rFonts w:ascii="Times New Roman" w:hAnsi="Times New Roman" w:eastAsia="Times New Roman"/>
+          <w:i w:val="0"/>
+          <w:color w:val="000000"/>
+          <w:sz w:val="24"/>
+        </w:rPr>
+        <w:t>and how to obtain the file. A retrospective language-model test can be contaminated by</w:t>
+      </w:r>
+    </w:p>
+    <w:p>
+      <w:pPr>
+        <w:spacing w:after="160" w:line="276" w:lineRule="auto"/>
+      </w:pPr>
+      <w:r>
+        <w:rPr>
+          <w:rFonts w:ascii="Times New Roman" w:hAnsi="Times New Roman" w:eastAsia="Times New Roman"/>
+          <w:i w:val="0"/>
+          <w:color w:val="000000"/>
+          <w:sz w:val="24"/>
+        </w:rPr>
+        <w:t>pretraining, so that check will be prospective or will use a local model with a known cutoff.</w:t>
+      </w:r>
+    </w:p>
+    <w:p>
+      <w:pPr>
+        <w:spacing w:after="160" w:line="276" w:lineRule="auto"/>
+      </w:pPr>
+      <w:r>
+        <w:rPr>
+          <w:rFonts w:ascii="Times New Roman" w:hAnsi="Times New Roman" w:eastAsia="Times New Roman"/>
+          <w:i w:val="0"/>
+          <w:color w:val="000000"/>
+          <w:sz w:val="24"/>
+        </w:rPr>
+        <w:t>This document is proposed work plus one preliminary study. It is not a finished doctorate, a</w:t>
+      </w:r>
+    </w:p>
+    <w:p>
+      <w:pPr>
+        <w:spacing w:after="160" w:line="276" w:lineRule="auto"/>
+      </w:pPr>
+      <w:r>
+        <w:rPr>
+          <w:rFonts w:ascii="Times New Roman" w:hAnsi="Times New Roman" w:eastAsia="Times New Roman"/>
+          <w:i w:val="0"/>
+          <w:color w:val="000000"/>
+          <w:sz w:val="24"/>
+        </w:rPr>
+        <w:t>trading system, or an agreed supervision.</w:t>
+      </w:r>
+    </w:p>
+    <w:p>
+      <w:pPr>
+        <w:spacing w:before="240" w:after="80"/>
+      </w:pPr>
+      <w:r>
+        <w:rPr>
+          <w:rFonts w:ascii="Times New Roman" w:hAnsi="Times New Roman" w:eastAsia="Times New Roman"/>
+          <w:b/>
+          <w:i w:val="0"/>
+          <w:color w:val="000000"/>
+          <w:sz w:val="26"/>
+        </w:rPr>
         <w:t>References</w:t>
       </w:r>
     </w:p>
     <w:p>
+      <w:pPr>
+        <w:spacing w:after="160" w:line="276" w:lineRule="auto"/>
+      </w:pPr>
       <w:r>
-        <w:t xml:space="preserve">1. Prokhorenkova, L., Gusev, G., Vorobev, A., Dorogush, A. V., and Gulin, A. (2018). </w:t>
+        <w:rPr>
+          <w:rFonts w:ascii="Times New Roman" w:hAnsi="Times New Roman" w:eastAsia="Times New Roman"/>
+          <w:i w:val="0"/>
+          <w:color w:val="000000"/>
+          <w:sz w:val="24"/>
+        </w:rPr>
+        <w:t xml:space="preserve">1. Hyndman, R. J., and Koehler, A. B. (2006). Another look at measures of forecast accuracy. </w:t>
       </w:r>
       <w:r>
         <w:rPr>
+          <w:rFonts w:ascii="Times New Roman" w:hAnsi="Times New Roman" w:eastAsia="Times New Roman"/>
           <w:i/>
+          <w:color w:val="000000"/>
+          <w:sz w:val="24"/>
         </w:rPr>
-        <w:t>CatBoost: unbiased boosting with categorical features</w:t>
+        <w:t>International Journal of Forecasting</w:t>
       </w:r>
       <w:r>
-        <w:t>. NeurIPS. https://arxiv.org/abs/1706.09516</w:t>
+        <w:rPr>
+          <w:rFonts w:ascii="Times New Roman" w:hAnsi="Times New Roman" w:eastAsia="Times New Roman"/>
+          <w:i w:val="0"/>
+          <w:color w:val="000000"/>
+          <w:sz w:val="24"/>
+        </w:rPr>
+        <w:t>, 22(4), 679–688. https://doi.org/10.1016/j.ijforecast.2006.03.001</w:t>
       </w:r>
     </w:p>
     <w:p>
+      <w:pPr>
+        <w:spacing w:after="160" w:line="276" w:lineRule="auto"/>
+      </w:pPr>
       <w:r>
-        <w:t xml:space="preserve">2. Jin, M., et al. (2024). </w:t>
+        <w:rPr>
+          <w:rFonts w:ascii="Times New Roman" w:hAnsi="Times New Roman" w:eastAsia="Times New Roman"/>
+          <w:i w:val="0"/>
+          <w:color w:val="000000"/>
+          <w:sz w:val="24"/>
+        </w:rPr>
+        <w:t xml:space="preserve">2. Diebold, F. X., and Mariano, R. S. (1995). Comparing predictive accuracy. </w:t>
       </w:r>
       <w:r>
         <w:rPr>
+          <w:rFonts w:ascii="Times New Roman" w:hAnsi="Times New Roman" w:eastAsia="Times New Roman"/>
           <w:i/>
+          <w:color w:val="000000"/>
+          <w:sz w:val="24"/>
         </w:rPr>
-        <w:t>Time-LLM: Time Series Forecasting by Reprogramming Large Language Models</w:t>
+        <w:t>Journal of Business &amp; Economic Statistics</w:t>
       </w:r>
       <w:r>
-        <w:t>. ICLR. https://arxiv.org/abs/2310.01728</w:t>
+        <w:rPr>
+          <w:rFonts w:ascii="Times New Roman" w:hAnsi="Times New Roman" w:eastAsia="Times New Roman"/>
+          <w:i w:val="0"/>
+          <w:color w:val="000000"/>
+          <w:sz w:val="24"/>
+        </w:rPr>
+        <w:t>, 13(3), 253–263. https://doi.org/10.1080/07350015.1995.10524599</w:t>
       </w:r>
     </w:p>
     <w:p>
+      <w:pPr>
+        <w:spacing w:after="160" w:line="276" w:lineRule="auto"/>
+      </w:pPr>
       <w:r>
-        <w:t xml:space="preserve">3. Zhao, H., et al. (2025). </w:t>
+        <w:rPr>
+          <w:rFonts w:ascii="Times New Roman" w:hAnsi="Times New Roman" w:eastAsia="Times New Roman"/>
+          <w:i w:val="0"/>
+          <w:color w:val="000000"/>
+          <w:sz w:val="24"/>
+        </w:rPr>
+        <w:t xml:space="preserve">3. Harvey, D., Leybourne, S., and Newbold, P. (1997). Testing the equality of prediction mean squared errors. </w:t>
       </w:r>
       <w:r>
         <w:rPr>
+          <w:rFonts w:ascii="Times New Roman" w:hAnsi="Times New Roman" w:eastAsia="Times New Roman"/>
           <w:i/>
+          <w:color w:val="000000"/>
+          <w:sz w:val="24"/>
         </w:rPr>
-        <w:t>TimeSeriesScientist: A General-Purpose AI Agent for Time Series Analysis</w:t>
+        <w:t>International Journal of Forecasting</w:t>
       </w:r>
       <w:r>
-        <w:t>. arXiv preprint. https://arxiv.org/abs/2510.01538</w:t>
+        <w:rPr>
+          <w:rFonts w:ascii="Times New Roman" w:hAnsi="Times New Roman" w:eastAsia="Times New Roman"/>
+          <w:i w:val="0"/>
+          <w:color w:val="000000"/>
+          <w:sz w:val="24"/>
+        </w:rPr>
+        <w:t>, 13(2), 281–291. https://doi.org/10.1016/S0169-2070(96)00719-4</w:t>
       </w:r>
     </w:p>
     <w:p>
+      <w:pPr>
+        <w:spacing w:after="160" w:line="276" w:lineRule="auto"/>
+      </w:pPr>
       <w:r>
-        <w:t xml:space="preserve">4. Gibbs, I., and Candès, E. (2021). </w:t>
+        <w:rPr>
+          <w:rFonts w:ascii="Times New Roman" w:hAnsi="Times New Roman" w:eastAsia="Times New Roman"/>
+          <w:i w:val="0"/>
+          <w:color w:val="000000"/>
+          <w:sz w:val="24"/>
+        </w:rPr>
+        <w:t xml:space="preserve">4. Tashman, L. J. (2000). Out-of-sample tests of forecasting accuracy: an analysis and review. </w:t>
       </w:r>
       <w:r>
         <w:rPr>
+          <w:rFonts w:ascii="Times New Roman" w:hAnsi="Times New Roman" w:eastAsia="Times New Roman"/>
           <w:i/>
+          <w:color w:val="000000"/>
+          <w:sz w:val="24"/>
         </w:rPr>
-        <w:t>Adaptive Conformal Inference Under Distribution Shift</w:t>
+        <w:t>International Journal of Forecasting</w:t>
       </w:r>
       <w:r>
-        <w:t>. arXiv preprint. https://arxiv.org/abs/2106.00170</w:t>
+        <w:rPr>
+          <w:rFonts w:ascii="Times New Roman" w:hAnsi="Times New Roman" w:eastAsia="Times New Roman"/>
+          <w:i w:val="0"/>
+          <w:color w:val="000000"/>
+          <w:sz w:val="24"/>
+        </w:rPr>
+        <w:t>, 16(4), 437–450. https://doi.org/10.1016/S0169-2070(00)00065-0</w:t>
       </w:r>
     </w:p>
     <w:p>
       <w:pPr>
-        <w:pStyle w:val="Heading1"/>
+        <w:spacing w:after="160" w:line="276" w:lineRule="auto"/>
       </w:pPr>
       <w:r>
-        <w:t>Research portfolio</w:t>
+        <w:rPr>
+          <w:rFonts w:ascii="Times New Roman" w:hAnsi="Times New Roman" w:eastAsia="Times New Roman"/>
+          <w:i w:val="0"/>
+          <w:color w:val="000000"/>
+          <w:sz w:val="24"/>
+        </w:rPr>
+        <w:t xml:space="preserve">5. Bergmeir, C., and Benítez, J. M. (2012). On the use of cross-validation for time series predictor evaluation. </w:t>
+      </w:r>
+      <w:r>
+        <w:rPr>
+          <w:rFonts w:ascii="Times New Roman" w:hAnsi="Times New Roman" w:eastAsia="Times New Roman"/>
+          <w:i/>
+          <w:color w:val="000000"/>
+          <w:sz w:val="24"/>
+        </w:rPr>
+        <w:t>Information Sciences</w:t>
+      </w:r>
+      <w:r>
+        <w:rPr>
+          <w:rFonts w:ascii="Times New Roman" w:hAnsi="Times New Roman" w:eastAsia="Times New Roman"/>
+          <w:i w:val="0"/>
+          <w:color w:val="000000"/>
+          <w:sz w:val="24"/>
+        </w:rPr>
+        <w:t>, 191, 192–213. https://doi.org/10.1016/j.ins.2011.12.028</w:t>
       </w:r>
     </w:p>
     <w:p>
+      <w:pPr>
+        <w:spacing w:after="160" w:line="276" w:lineRule="auto"/>
+      </w:pPr>
       <w:r>
-        <w:t>https://github.com/tuanthescientist/Timeseries_Forecasting_Research_and_Build</w:t>
+        <w:rPr>
+          <w:rFonts w:ascii="Times New Roman" w:hAnsi="Times New Roman" w:eastAsia="Times New Roman"/>
+          <w:i w:val="0"/>
+          <w:color w:val="000000"/>
+          <w:sz w:val="24"/>
+        </w:rPr>
+        <w:t xml:space="preserve">6. Makridakis, S., Spiliotis, E., and Assimakopoulos, V. (2020). The M4 Competition: 100,000 time series and 61 forecasting methods. </w:t>
+      </w:r>
+      <w:r>
+        <w:rPr>
+          <w:rFonts w:ascii="Times New Roman" w:hAnsi="Times New Roman" w:eastAsia="Times New Roman"/>
+          <w:i/>
+          <w:color w:val="000000"/>
+          <w:sz w:val="24"/>
+        </w:rPr>
+        <w:t>International Journal of Forecasting</w:t>
+      </w:r>
+      <w:r>
+        <w:rPr>
+          <w:rFonts w:ascii="Times New Roman" w:hAnsi="Times New Roman" w:eastAsia="Times New Roman"/>
+          <w:i w:val="0"/>
+          <w:color w:val="000000"/>
+          <w:sz w:val="24"/>
+        </w:rPr>
+        <w:t>, 36(1), 54–74. https://doi.org/10.1016/j.ijforecast.2019.04.014</w:t>
+      </w:r>
+    </w:p>
+    <w:p>
+      <w:pPr>
+        <w:spacing w:after="160" w:line="276" w:lineRule="auto"/>
+      </w:pPr>
+      <w:r>
+        <w:rPr>
+          <w:rFonts w:ascii="Times New Roman" w:hAnsi="Times New Roman" w:eastAsia="Times New Roman"/>
+          <w:i w:val="0"/>
+          <w:color w:val="000000"/>
+          <w:sz w:val="24"/>
+        </w:rPr>
+        <w:t xml:space="preserve">7. Makridakis, S., Spiliotis, E., and Assimakopoulos, V. (2022). M5 accuracy competition: Results, findings, and conclusions. </w:t>
+      </w:r>
+      <w:r>
+        <w:rPr>
+          <w:rFonts w:ascii="Times New Roman" w:hAnsi="Times New Roman" w:eastAsia="Times New Roman"/>
+          <w:i/>
+          <w:color w:val="000000"/>
+          <w:sz w:val="24"/>
+        </w:rPr>
+        <w:t>International Journal of Forecasting</w:t>
+      </w:r>
+      <w:r>
+        <w:rPr>
+          <w:rFonts w:ascii="Times New Roman" w:hAnsi="Times New Roman" w:eastAsia="Times New Roman"/>
+          <w:i w:val="0"/>
+          <w:color w:val="000000"/>
+          <w:sz w:val="24"/>
+        </w:rPr>
+        <w:t>, 38(4), 1346–1364. https://doi.org/10.1016/j.ijforecast.2021.11.013</w:t>
+      </w:r>
+    </w:p>
+    <w:p>
+      <w:pPr>
+        <w:spacing w:after="160" w:line="276" w:lineRule="auto"/>
+      </w:pPr>
+      <w:r>
+        <w:rPr>
+          <w:rFonts w:ascii="Times New Roman" w:hAnsi="Times New Roman" w:eastAsia="Times New Roman"/>
+          <w:i w:val="0"/>
+          <w:color w:val="000000"/>
+          <w:sz w:val="24"/>
+        </w:rPr>
+        <w:t xml:space="preserve">8. Romano, Y., Patterson, E., and Candès, E. (2019). Conformalized quantile regression. </w:t>
+      </w:r>
+      <w:r>
+        <w:rPr>
+          <w:rFonts w:ascii="Times New Roman" w:hAnsi="Times New Roman" w:eastAsia="Times New Roman"/>
+          <w:i/>
+          <w:color w:val="000000"/>
+          <w:sz w:val="24"/>
+        </w:rPr>
+        <w:t>Advances in Neural Information Processing Systems</w:t>
+      </w:r>
+      <w:r>
+        <w:rPr>
+          <w:rFonts w:ascii="Times New Roman" w:hAnsi="Times New Roman" w:eastAsia="Times New Roman"/>
+          <w:i w:val="0"/>
+          <w:color w:val="000000"/>
+          <w:sz w:val="24"/>
+        </w:rPr>
+        <w:t>, 32. https://arxiv.org/abs/1905.03222</w:t>
+      </w:r>
+    </w:p>
+    <w:p>
+      <w:pPr>
+        <w:spacing w:after="160" w:line="276" w:lineRule="auto"/>
+      </w:pPr>
+      <w:r>
+        <w:rPr>
+          <w:rFonts w:ascii="Times New Roman" w:hAnsi="Times New Roman" w:eastAsia="Times New Roman"/>
+          <w:i w:val="0"/>
+          <w:color w:val="000000"/>
+          <w:sz w:val="24"/>
+        </w:rPr>
+        <w:t xml:space="preserve">9. Barber, R. F., Candès, E. J., Ramdas, A., and Tibshirani, R. J. (2023). Conformal prediction beyond exchangeability. </w:t>
+      </w:r>
+      <w:r>
+        <w:rPr>
+          <w:rFonts w:ascii="Times New Roman" w:hAnsi="Times New Roman" w:eastAsia="Times New Roman"/>
+          <w:i/>
+          <w:color w:val="000000"/>
+          <w:sz w:val="24"/>
+        </w:rPr>
+        <w:t>The Annals of Statistics</w:t>
+      </w:r>
+      <w:r>
+        <w:rPr>
+          <w:rFonts w:ascii="Times New Roman" w:hAnsi="Times New Roman" w:eastAsia="Times New Roman"/>
+          <w:i w:val="0"/>
+          <w:color w:val="000000"/>
+          <w:sz w:val="24"/>
+        </w:rPr>
+        <w:t>, 51(2), 816–845. https://arxiv.org/abs/2202.13415</w:t>
+      </w:r>
+    </w:p>
+    <w:p>
+      <w:pPr>
+        <w:spacing w:after="160" w:line="276" w:lineRule="auto"/>
+      </w:pPr>
+      <w:r>
+        <w:rPr>
+          <w:rFonts w:ascii="Times New Roman" w:hAnsi="Times New Roman" w:eastAsia="Times New Roman"/>
+          <w:i w:val="0"/>
+          <w:color w:val="000000"/>
+          <w:sz w:val="24"/>
+        </w:rPr>
+        <w:t xml:space="preserve">10. Xu, C., and Xie, Y. (2021). Conformal prediction interval for dynamic time-series. </w:t>
+      </w:r>
+      <w:r>
+        <w:rPr>
+          <w:rFonts w:ascii="Times New Roman" w:hAnsi="Times New Roman" w:eastAsia="Times New Roman"/>
+          <w:i/>
+          <w:color w:val="000000"/>
+          <w:sz w:val="24"/>
+        </w:rPr>
+        <w:t>Proceedings of the 38th International Conference on Machine Learning</w:t>
+      </w:r>
+      <w:r>
+        <w:rPr>
+          <w:rFonts w:ascii="Times New Roman" w:hAnsi="Times New Roman" w:eastAsia="Times New Roman"/>
+          <w:i w:val="0"/>
+          <w:color w:val="000000"/>
+          <w:sz w:val="24"/>
+        </w:rPr>
+        <w:t>, PMLR 139, 11559–11569. https://arxiv.org/abs/2010.09107</w:t>
+      </w:r>
+    </w:p>
+    <w:p>
+      <w:pPr>
+        <w:spacing w:after="160" w:line="276" w:lineRule="auto"/>
+      </w:pPr>
+      <w:r>
+        <w:rPr>
+          <w:rFonts w:ascii="Times New Roman" w:hAnsi="Times New Roman" w:eastAsia="Times New Roman"/>
+          <w:i w:val="0"/>
+          <w:color w:val="000000"/>
+          <w:sz w:val="24"/>
+        </w:rPr>
+        <w:t xml:space="preserve">11. Stankevičiūtė, K., Alaa, A. M., and van der Schaar, M. (2021). Conformal time-series forecasting. </w:t>
+      </w:r>
+      <w:r>
+        <w:rPr>
+          <w:rFonts w:ascii="Times New Roman" w:hAnsi="Times New Roman" w:eastAsia="Times New Roman"/>
+          <w:i/>
+          <w:color w:val="000000"/>
+          <w:sz w:val="24"/>
+        </w:rPr>
+        <w:t>Advances in Neural Information Processing Systems</w:t>
+      </w:r>
+      <w:r>
+        <w:rPr>
+          <w:rFonts w:ascii="Times New Roman" w:hAnsi="Times New Roman" w:eastAsia="Times New Roman"/>
+          <w:i w:val="0"/>
+          <w:color w:val="000000"/>
+          <w:sz w:val="24"/>
+        </w:rPr>
+        <w:t>, 34. https://proceedings.neurips.cc/paper/2021/hash/312f1ba2a72318edaaa995a67835fad5-Abstract.html</w:t>
+      </w:r>
+    </w:p>
+    <w:p>
+      <w:pPr>
+        <w:spacing w:after="160" w:line="276" w:lineRule="auto"/>
+      </w:pPr>
+      <w:r>
+        <w:rPr>
+          <w:rFonts w:ascii="Times New Roman" w:hAnsi="Times New Roman" w:eastAsia="Times New Roman"/>
+          <w:i w:val="0"/>
+          <w:color w:val="000000"/>
+          <w:sz w:val="24"/>
+        </w:rPr>
+        <w:t xml:space="preserve">12. Gibbs, I., and Candès, E. (2021). Adaptive conformal inference under distribution shift. </w:t>
+      </w:r>
+      <w:r>
+        <w:rPr>
+          <w:rFonts w:ascii="Times New Roman" w:hAnsi="Times New Roman" w:eastAsia="Times New Roman"/>
+          <w:i/>
+          <w:color w:val="000000"/>
+          <w:sz w:val="24"/>
+        </w:rPr>
+        <w:t>Advances in Neural Information Processing Systems</w:t>
+      </w:r>
+      <w:r>
+        <w:rPr>
+          <w:rFonts w:ascii="Times New Roman" w:hAnsi="Times New Roman" w:eastAsia="Times New Roman"/>
+          <w:i w:val="0"/>
+          <w:color w:val="000000"/>
+          <w:sz w:val="24"/>
+        </w:rPr>
+        <w:t>, 34. https://arxiv.org/abs/2106.00170</w:t>
+      </w:r>
+    </w:p>
+    <w:p>
+      <w:pPr>
+        <w:spacing w:after="160" w:line="276" w:lineRule="auto"/>
+      </w:pPr>
+      <w:r>
+        <w:rPr>
+          <w:rFonts w:ascii="Times New Roman" w:hAnsi="Times New Roman" w:eastAsia="Times New Roman"/>
+          <w:i w:val="0"/>
+          <w:color w:val="000000"/>
+          <w:sz w:val="24"/>
+        </w:rPr>
+        <w:t xml:space="preserve">13. Gneiting, T., and Raftery, A. E. (2007). Strictly proper scoring rules, prediction, and estimation. </w:t>
+      </w:r>
+      <w:r>
+        <w:rPr>
+          <w:rFonts w:ascii="Times New Roman" w:hAnsi="Times New Roman" w:eastAsia="Times New Roman"/>
+          <w:i/>
+          <w:color w:val="000000"/>
+          <w:sz w:val="24"/>
+        </w:rPr>
+        <w:t>Journal of the American Statistical Association</w:t>
+      </w:r>
+      <w:r>
+        <w:rPr>
+          <w:rFonts w:ascii="Times New Roman" w:hAnsi="Times New Roman" w:eastAsia="Times New Roman"/>
+          <w:i w:val="0"/>
+          <w:color w:val="000000"/>
+          <w:sz w:val="24"/>
+        </w:rPr>
+        <w:t>, 102(477), 359–378. https://doi.org/10.1198/016214506000001437</w:t>
+      </w:r>
+    </w:p>
+    <w:p>
+      <w:pPr>
+        <w:spacing w:after="160" w:line="276" w:lineRule="auto"/>
+      </w:pPr>
+      <w:r>
+        <w:rPr>
+          <w:rFonts w:ascii="Times New Roman" w:hAnsi="Times New Roman" w:eastAsia="Times New Roman"/>
+          <w:i w:val="0"/>
+          <w:color w:val="000000"/>
+          <w:sz w:val="24"/>
+        </w:rPr>
+        <w:t xml:space="preserve">14. Ansari, A. F., Stella, L., Turkmen, C., Zhang, X., Mercado, P., Shen, H., Shchur, O., Rangapuram, S. S., Pineda Arango, S., Kapoor, S., Zschiegner, J., Maddix, D. C., Wang, H., Mahoney, M. W., Torkkola, K., Wilson, A. G., Bohlke-Schneider, M., and Wang, Y. (2024). Chronos: Learning the language of time series. </w:t>
+      </w:r>
+      <w:r>
+        <w:rPr>
+          <w:rFonts w:ascii="Times New Roman" w:hAnsi="Times New Roman" w:eastAsia="Times New Roman"/>
+          <w:i/>
+          <w:color w:val="000000"/>
+          <w:sz w:val="24"/>
+        </w:rPr>
+        <w:t>Transactions on Machine Learning Research</w:t>
+      </w:r>
+      <w:r>
+        <w:rPr>
+          <w:rFonts w:ascii="Times New Roman" w:hAnsi="Times New Roman" w:eastAsia="Times New Roman"/>
+          <w:i w:val="0"/>
+          <w:color w:val="000000"/>
+          <w:sz w:val="24"/>
+        </w:rPr>
+        <w:t>. https://arxiv.org/abs/2403.07815</w:t>
+      </w:r>
+    </w:p>
+    <w:p>
+      <w:pPr>
+        <w:spacing w:after="160" w:line="276" w:lineRule="auto"/>
+      </w:pPr>
+      <w:r>
+        <w:rPr>
+          <w:rFonts w:ascii="Times New Roman" w:hAnsi="Times New Roman" w:eastAsia="Times New Roman"/>
+          <w:i w:val="0"/>
+          <w:color w:val="000000"/>
+          <w:sz w:val="24"/>
+        </w:rPr>
+        <w:t xml:space="preserve">15. Das, A., Kong, W., Sen, R., and Zhou, Y. (2024). A decoder-only foundation model for time-series forecasting. </w:t>
+      </w:r>
+      <w:r>
+        <w:rPr>
+          <w:rFonts w:ascii="Times New Roman" w:hAnsi="Times New Roman" w:eastAsia="Times New Roman"/>
+          <w:i/>
+          <w:color w:val="000000"/>
+          <w:sz w:val="24"/>
+        </w:rPr>
+        <w:t>Proceedings of the 41st International Conference on Machine Learning</w:t>
+      </w:r>
+      <w:r>
+        <w:rPr>
+          <w:rFonts w:ascii="Times New Roman" w:hAnsi="Times New Roman" w:eastAsia="Times New Roman"/>
+          <w:i w:val="0"/>
+          <w:color w:val="000000"/>
+          <w:sz w:val="24"/>
+        </w:rPr>
+        <w:t>, PMLR 235. https://arxiv.org/abs/2310.10688</w:t>
+      </w:r>
+    </w:p>
+    <w:p>
+      <w:pPr>
+        <w:spacing w:after="160" w:line="276" w:lineRule="auto"/>
+      </w:pPr>
+      <w:r>
+        <w:rPr>
+          <w:rFonts w:ascii="Times New Roman" w:hAnsi="Times New Roman" w:eastAsia="Times New Roman"/>
+          <w:i w:val="0"/>
+          <w:color w:val="000000"/>
+          <w:sz w:val="24"/>
+        </w:rPr>
+        <w:t xml:space="preserve">16. Woo, G., Liu, C., Kumar, A., Xiong, C., Savarese, S., and Sahoo, D. (2024). Unified training of universal time series forecasting transformers. </w:t>
+      </w:r>
+      <w:r>
+        <w:rPr>
+          <w:rFonts w:ascii="Times New Roman" w:hAnsi="Times New Roman" w:eastAsia="Times New Roman"/>
+          <w:i/>
+          <w:color w:val="000000"/>
+          <w:sz w:val="24"/>
+        </w:rPr>
+        <w:t>Proceedings of the 41st International Conference on Machine Learning</w:t>
+      </w:r>
+      <w:r>
+        <w:rPr>
+          <w:rFonts w:ascii="Times New Roman" w:hAnsi="Times New Roman" w:eastAsia="Times New Roman"/>
+          <w:i w:val="0"/>
+          <w:color w:val="000000"/>
+          <w:sz w:val="24"/>
+        </w:rPr>
+        <w:t>, PMLR 235. https://arxiv.org/abs/2402.02592</w:t>
+      </w:r>
+    </w:p>
+    <w:p>
+      <w:pPr>
+        <w:spacing w:after="160" w:line="276" w:lineRule="auto"/>
+      </w:pPr>
+      <w:r>
+        <w:rPr>
+          <w:rFonts w:ascii="Times New Roman" w:hAnsi="Times New Roman" w:eastAsia="Times New Roman"/>
+          <w:i w:val="0"/>
+          <w:color w:val="000000"/>
+          <w:sz w:val="24"/>
+        </w:rPr>
+        <w:t xml:space="preserve">17. Jin, M., Wang, S., Ma, L., Chu, Z., Zhang, J. Y., Shi, X., Chen, P.-Y., Liang, Y., Li, Y.-F., Pan, S., and Wen, Q. (2024). Time-LLM: Time series forecasting by reprogramming large language models. </w:t>
+      </w:r>
+      <w:r>
+        <w:rPr>
+          <w:rFonts w:ascii="Times New Roman" w:hAnsi="Times New Roman" w:eastAsia="Times New Roman"/>
+          <w:i/>
+          <w:color w:val="000000"/>
+          <w:sz w:val="24"/>
+        </w:rPr>
+        <w:t>International Conference on Learning Representations</w:t>
+      </w:r>
+      <w:r>
+        <w:rPr>
+          <w:rFonts w:ascii="Times New Roman" w:hAnsi="Times New Roman" w:eastAsia="Times New Roman"/>
+          <w:i w:val="0"/>
+          <w:color w:val="000000"/>
+          <w:sz w:val="24"/>
+        </w:rPr>
+        <w:t>. https://arxiv.org/abs/2310.01728</w:t>
+      </w:r>
+    </w:p>
+    <w:p>
+      <w:pPr>
+        <w:spacing w:after="160" w:line="276" w:lineRule="auto"/>
+      </w:pPr>
+      <w:r>
+        <w:rPr>
+          <w:rFonts w:ascii="Times New Roman" w:hAnsi="Times New Roman" w:eastAsia="Times New Roman"/>
+          <w:i w:val="0"/>
+          <w:color w:val="000000"/>
+          <w:sz w:val="24"/>
+        </w:rPr>
+        <w:t xml:space="preserve">18. Tan, M., Merrill, M. A., Gupta, V., Althoff, T., and Hartvigsen, T. (2024). Are language models actually useful for time series forecasting? </w:t>
+      </w:r>
+      <w:r>
+        <w:rPr>
+          <w:rFonts w:ascii="Times New Roman" w:hAnsi="Times New Roman" w:eastAsia="Times New Roman"/>
+          <w:i/>
+          <w:color w:val="000000"/>
+          <w:sz w:val="24"/>
+        </w:rPr>
+        <w:t>Advances in Neural Information Processing Systems</w:t>
+      </w:r>
+      <w:r>
+        <w:rPr>
+          <w:rFonts w:ascii="Times New Roman" w:hAnsi="Times New Roman" w:eastAsia="Times New Roman"/>
+          <w:i w:val="0"/>
+          <w:color w:val="000000"/>
+          <w:sz w:val="24"/>
+        </w:rPr>
+        <w:t>, 37. https://arxiv.org/abs/2406.16964</w:t>
+      </w:r>
+    </w:p>
+    <w:p>
+      <w:pPr>
+        <w:spacing w:after="160" w:line="276" w:lineRule="auto"/>
+      </w:pPr>
+      <w:r>
+        <w:rPr>
+          <w:rFonts w:ascii="Times New Roman" w:hAnsi="Times New Roman" w:eastAsia="Times New Roman"/>
+          <w:i w:val="0"/>
+          <w:color w:val="000000"/>
+          <w:sz w:val="24"/>
+        </w:rPr>
+        <w:t>19. Zhao, H., et al. (2025). TimeSeriesScientist: A general-purpose AI agent for time series analysis. arXiv preprint. https://arxiv.org/abs/2510.01538</w:t>
+      </w:r>
+    </w:p>
+    <w:p>
+      <w:pPr>
+        <w:spacing w:after="160" w:line="276" w:lineRule="auto"/>
+      </w:pPr>
+      <w:r>
+        <w:rPr>
+          <w:rFonts w:ascii="Times New Roman" w:hAnsi="Times New Roman" w:eastAsia="Times New Roman"/>
+          <w:i w:val="0"/>
+          <w:color w:val="000000"/>
+          <w:sz w:val="24"/>
+        </w:rPr>
+        <w:t>Repository: https://github.com/tuanthescientist/Timeseries_Forecasting_Research_and_Build</w:t>
       </w:r>
     </w:p>
     <w:sectPr>
-      <w:footerReference w:type="default" r:id="rId9"/>
       <w:pgSz w:w="12240" w:h="15840"/>
-      <w:pgMar w:top="1080" w:right="1152" w:bottom="1080" w:left="1152" w:header="720" w:footer="720" w:gutter="0"/>
+      <w:pgMar w:top="1247" w:right="1361" w:bottom="1247" w:left="1361" w:header="720" w:footer="720" w:gutter="0"/>
       <w:cols w:space="720"/>
       <w:docGrid w:linePitch="360"/>
     </w:sectPr>
   </w:body>
 </w:document>
-</file>
-
-<file path=word/footer1.xml><?xml version="1.0" encoding="utf-8"?>
-<w:ftr xmlns:m="http://schemas.openxmlformats.org/officeDocument/2006/math" xmlns:mc="http://schemas.openxmlformats.org/markup-compatibility/2006" xmlns:mo="http://schemas.microsoft.com/office/mac/office/2008/main" xmlns:mv="urn:schemas-microsoft-com:mac:vml" xmlns:o="urn:schemas-microsoft-com:office:office" xmlns:r="http://schemas.openxmlformats.org/officeDocument/2006/relationships" xmlns:v="urn:schemas-microsoft-com:vml" xmlns:w10="urn:schemas-microsoft-com:office:word" xmlns:w14="http://schemas.microsoft.com/office/word/2010/wordml" xmlns:w="http://schemas.openxmlformats.org/wordprocessingml/2006/main" xmlns:wne="http://schemas.microsoft.com/office/word/2006/wordml" xmlns:wp14="http://schemas.microsoft.com/office/word/2010/wordprocessingDrawing" xmlns:wp="http://schemas.openxmlformats.org/drawingml/2006/wordprocessingDrawing" xmlns:wpc="http://schemas.microsoft.com/office/word/2010/wordprocessingCanvas" xmlns:wpg="http://schemas.microsoft.com/office/word/2010/wordprocessingGroup" xmlns:wpi="http://schemas.microsoft.com/office/word/2010/wordprocessingInk" xmlns:wps="http://schemas.microsoft.com/office/word/2010/wordprocessingShape" mc:Ignorable="w14 wp14">
-  <w:p>
-    <w:pPr>
-      <w:pStyle w:val="Footer"/>
-      <w:jc w:val="right"/>
-    </w:pPr>
-    <w:r>
-      <w:rPr>
-        <w:color w:val="666666"/>
-        <w:sz w:val="18"/>
-      </w:rPr>
-      <w:t xml:space="preserve">Trần Anh Tuân  |  Research proposal  |  </w:t>
-    </w:r>
-    <w:fldSimple w:instr="PAGE"/>
-  </w:p>
-</w:ftr>
 </file>
 
 <file path=word/numbering.xml><?xml version="1.0" encoding="utf-8"?>
@@ -861,12 +4717,9 @@
     <w:name w:val="Normal"/>
     <w:qFormat/>
     <w:rsid w:val="00FC693F"/>
-    <w:pPr>
-      <w:spacing w:after="140" w:line="259" w:lineRule="auto"/>
-    </w:pPr>
     <w:rPr>
-      <w:rFonts w:ascii="Calibri" w:hAnsi="Calibri"/>
-      <w:sz w:val="22"/>
+      <w:rFonts w:ascii="Times New Roman" w:hAnsi="Times New Roman" w:eastAsia="Times New Roman"/>
+      <w:sz w:val="24"/>
     </w:rPr>
   </w:style>
   <w:style w:type="paragraph" w:styleId="Header">
@@ -924,14 +4777,14 @@
     <w:pPr>
       <w:keepNext/>
       <w:keepLines/>
-      <w:spacing w:before="240" w:after="100"/>
+      <w:spacing w:before="480" w:after="0"/>
       <w:outlineLvl w:val="0"/>
     </w:pPr>
     <w:rPr>
-      <w:rFonts w:asciiTheme="majorHAnsi" w:eastAsiaTheme="majorEastAsia" w:hAnsiTheme="majorHAnsi" w:cstheme="majorBidi" w:ascii="Calibri" w:hAnsi="Calibri"/>
+      <w:rFonts w:asciiTheme="majorHAnsi" w:eastAsiaTheme="majorEastAsia" w:hAnsiTheme="majorHAnsi" w:cstheme="majorBidi"/>
       <w:b/>
       <w:bCs/>
-      <w:color w:val="17365D"/>
+      <w:color w:val="365F91" w:themeColor="accent1" w:themeShade="BF"/>
       <w:sz w:val="28"/>
       <w:szCs w:val="28"/>
     </w:rPr>
@@ -948,15 +4801,15 @@
     <w:pPr>
       <w:keepNext/>
       <w:keepLines/>
-      <w:spacing w:before="240" w:after="100"/>
+      <w:spacing w:before="200" w:after="0"/>
       <w:outlineLvl w:val="1"/>
     </w:pPr>
     <w:rPr>
-      <w:rFonts w:asciiTheme="majorHAnsi" w:eastAsiaTheme="majorEastAsia" w:hAnsiTheme="majorHAnsi" w:cstheme="majorBidi" w:ascii="Calibri" w:hAnsi="Calibri"/>
+      <w:rFonts w:asciiTheme="majorHAnsi" w:eastAsiaTheme="majorEastAsia" w:hAnsiTheme="majorHAnsi" w:cstheme="majorBidi"/>
       <w:b/>
       <w:bCs/>
-      <w:color w:val="17365D"/>
-      <w:sz w:val="24"/>
+      <w:color w:val="4F81BD" w:themeColor="accent1"/>
+      <w:sz w:val="26"/>
       <w:szCs w:val="26"/>
     </w:rPr>
   </w:style>
@@ -1210,6 +5063,9 @@
     <w:qFormat/>
     <w:rsid w:val="00FC693F"/>
     <w:pPr>
+      <w:pBdr>
+        <w:bottom w:val="single" w:sz="8" w:space="4" w:color="4F81BD" w:themeColor="accent1"/>
+      </w:pBdr>
       <w:spacing w:after="300" w:line="240" w:lineRule="auto"/>
       <w:contextualSpacing/>
     </w:pPr>
@@ -1694,6 +5550,9 @@
     <w:qFormat/>
     <w:rsid w:val="00FC693F"/>
     <w:pPr>
+      <w:pBdr>
+        <w:bottom w:val="single" w:sz="4" w:space="4" w:color="4F81BD" w:themeColor="accent1"/>
+      </w:pBdr>
       <w:spacing w:before="200" w:after="280"/>
       <w:ind w:left="936" w:right="936"/>
     </w:pPr>

</xml_diff>